<commit_message>
docs(manuscrito): resultados do E1 (1.070 predicoes; reprodutibilidade do Boltz-2 rho=0,57; linear x ciclico rho=0,50), Figura 8, QC de pose post hoc, limitacoes
Co-Authored-By: Claude Sonnet 5.5 <noreply@anthropic.com>
</commit_message>
<xml_diff>
--- a/manuscript/Manuscrito_PT_leitura_novo.docx
+++ b/manuscript/Manuscrito_PT_leitura_novo.docx
@@ -342,7 +342,7 @@
               <w:rPr>
                 <w:sz w:val="18"/>
               </w:rPr>
-              <w:t xml:space="preserve">6,753 palavras no original em inglês (corpo sem tabelas, títulos e legendas; cada citação contada como uma palavra); tradução: 7,335</w:t>
+              <w:t xml:space="preserve">7,105 palavras no original em inglês (corpo sem tabelas, títulos e legendas; cada citação contada como uma palavra); tradução: 7,698</w:t>
             </w:r>
           </w:p>
         </w:tc>
@@ -404,7 +404,7 @@
               <w:rPr>
                 <w:sz w:val="18"/>
               </w:rPr>
-              <w:t xml:space="preserve">311 palavras no original em inglês sem o trecho pendente (≈ 340 com ele preenchido); tradução: 356</w:t>
+              <w:t xml:space="preserve">337 palavras no original em inglês sem o trecho pendente (≈ 346 com ele preenchido); tradução: 382</w:t>
             </w:r>
           </w:p>
         </w:tc>
@@ -652,7 +652,7 @@
               <w:rPr>
                 <w:sz w:val="18"/>
               </w:rPr>
-              <w:t xml:space="preserve">7 figuras + 2 suplementares em PNG, TIFF (LZW) e PDF vetorial a 300 dpi, largura 180 mm, RGB; as figuras dos resultados pendentes (Seções 3.8–3.10) ainda serão geradas</w:t>
+              <w:t xml:space="preserve">8 figuras + 2 suplementares em PNG, TIFF (LZW) e PDF vetorial a 300 dpi, largura 180 mm, RGB; as figuras dos resultados pendentes (Seções 3.8–3.10) ainda serão geradas</w:t>
             </w:r>
           </w:p>
         </w:tc>
@@ -1378,7 +1378,7 @@
     </w:p>
     <w:bookmarkEnd w:id="11"/>
     <w:bookmarkEnd w:id="12"/>
-    <w:bookmarkStart w:id="78" w:name="Xaea1da447ef5fee1fbbe056814497d6ce16bf65"/>
+    <w:bookmarkStart w:id="81" w:name="Xaea1da447ef5fee1fbbe056814497d6ce16bf65"/>
     <w:p>
       <w:pPr>
         <w:pStyle w:val="Heading1"/>
@@ -1655,7 +1655,7 @@
         <w:t xml:space="preserve"> </w:t>
       </w:r>
       <w:r>
-        <w:t xml:space="preserve">sobre esqueletos macrocíclicos cabeça-cauda (RFdiffusion, ProteinMPNN). As sequências foram triadas por um escore de motivos e por um critério duro de não clivabilidade (nenhum resíduo P1 de proteases do intestino médio do tipo tripsina, quimotripsina ou elastase; nenhum C-terminal clivável nos peptídeos lineares); as sobreviventes são co-dobradas com o Boltz-2 e simuladas por 10 ns em pH 10,0 como peptídeos lineares e como macrociclos.</w:t>
+        <w:t xml:space="preserve">sobre esqueletos macrocíclicos cabeça-cauda (RFdiffusion, ProteinMPNN). As sequências foram triadas por um escore de motivos e por um critério duro de não clivabilidade (nenhum resíduo P1 de proteases do intestino médio do tipo tripsina, quimotripsina ou elastase); as sobreviventes são co-dobradas com o Boltz-2 e simuladas por 10 ns em pH 10,0 como peptídeos lineares e como macrociclos.</w:t>
       </w:r>
       <w:r>
         <w:t xml:space="preserve"> </w:t>
@@ -1671,7 +1671,7 @@
         <w:t xml:space="preserve"> </w:t>
       </w:r>
       <w:r>
-        <w:t xml:space="preserve">Os subsítios foram transferidos nos 20 pares receptor–molde (TM-score 0,946–0,957). O Boltz-2 pontuou o inibidor natural acima de sua isca embaralhada em 10 de 10 pares, e o RMSD do ligante em 9 de 10, enquanto o MM-GBSA o fez em 4 de 10 e acompanhou o tamanho da interface (ρ = −0,93). A triagem por motivos reteve 1.829 sequências (confiança do Boltz-2 0,862, dentro da faixa de uma isca embaralhada de SFTI-1, 0,944). O critério duro reteve 527 sequências lineares e 543 cíclicas (2,4–2,5%), 49% glicina, com 9 de 4.060 resíduos lisina ou arginina, cada um antes de prolina.</w:t>
+        <w:t xml:space="preserve">Os subsítios foram transferidos nos 20 pares receptor–molde (TM-score 0,946–0,957). O Boltz-2 pontuou o inibidor natural acima de sua isca embaralhada em 10 de 10 pares, e o RMSD do ligante em 9 de 10, enquanto o MM-GBSA o fez em 4 de 10 e acompanhou o tamanho da interface (ρ = −0,93). A triagem por motivos reteve 1.829 sequências (confiança do Boltz-2 0,862, dentro da faixa de uma isca embaralhada de SFTI-1, 0,944). O critério duro reteve 527 sequências lineares e 543 cíclicas (2,4–2,5%), 49% glicina, com 9 de 4.060 resíduos lisina ou arginina, cada um antes de prolina. Repetir o Boltz-2 em entradas idênticas deu correlação de postos de 0,57 entre rodadas (n = 442), próxima dos 0,50 entre as formas linear e cíclica da mesma sequência (n = 527).</w:t>
       </w:r>
       <w:r>
         <w:t xml:space="preserve"> </w:t>
@@ -1680,7 +1680,7 @@
         <w:rPr>
           <w:rStyle w:val="Pendente"/>
         </w:rPr>
-        <w:t xml:space="preserve">PENDENTE: Boltz-2 das duas frentes com controles embaralhados pareados, controle de qualidade de pose e o número de candidatos por frente que cumprem os critérios de ocupância de S1 e de integridade do anel nas simulações de 10 ns.</w:t>
+        <w:t xml:space="preserve">PENDENTE: controles pareados, controle de qualidade de pose e simulações de 10 ns.</w:t>
       </w:r>
       <w:r>
         <w:t xml:space="preserve"> </w:t>
@@ -3278,7 +3278,7 @@
     </w:p>
     <w:bookmarkEnd w:id="30"/>
     <w:bookmarkEnd w:id="31"/>
-    <w:bookmarkStart w:id="57" w:name="resultados"/>
+    <w:bookmarkStart w:id="60" w:name="resultados"/>
     <w:p>
       <w:pPr>
         <w:pStyle w:val="Heading2"/>
@@ -8415,7 +8415,7 @@
       </w:r>
     </w:p>
     <w:bookmarkEnd w:id="53"/>
-    <w:bookmarkStart w:id="54" w:name="Xf753ede3a5630ce14f46131bf2938f6f71a90f5"/>
+    <w:bookmarkStart w:id="57" w:name="Xf753ede3a5630ce14f46131bf2938f6f71a90f5"/>
     <w:p>
       <w:pPr>
         <w:pStyle w:val="Heading3"/>
@@ -8430,13 +8430,112 @@
       </w:pPr>
       <w:r>
         <w:rPr>
+          <w:i/>
+          <w:iCs/>
+        </w:rPr>
+        <w:t xml:space="preserve">Triagem nas duas frentes (E1).</w:t>
+      </w:r>
+      <w:r>
+        <w:t xml:space="preserve"> </w:t>
+      </w:r>
+      <w:r>
+        <w:t xml:space="preserve">Todos os 527 candidatos lineares e 543 cíclicos foram preditos (1.070 predições; uma predição cíclica falhou no pré-processamento e foi repetida). A confiança média foi 0,874 na forma linear e 0,862 na cíclica. Predizer 442 candidatos cíclicos uma segunda vez com entrada idêntica deu correlação de postos de apenas 0,57 entre rodadas (diferença absoluta média 0,028; 0,21–0,69 por espécie; Figura 8A). As predições linear e cíclica da mesma sequência (n = 527) correlacionaram-se em 0,50 (diferença absoluta média 0,033; 0,16–0,44 por espécie), e a forma linear foi maior em 0,013 em média (Figura 8B). A concordância de postos entre as duas modalidades é, portanto, próxima da concordância entre duas rodadas da mesma modalidade, e uma única predição não separa um efeito da modalidade do ruído de amostragem. O mesmo ruído afeta a escolha dos dez melhores candidatos por espécie no E1, e por isso o E2 repete cada um deles com cinco amostras e três sementes. Os três melhores do ranking do E1 compartilharam ao menos uma sequência entre as frentes em quatro das oito espécies e nenhuma nas outras quatro; essas não são as seleções finais. Em uma olhada</w:t>
+      </w:r>
+      <w:r>
+        <w:t xml:space="preserve"> </w:t>
+      </w:r>
+      <w:r>
+        <w:rPr>
+          <w:i/>
+          <w:iCs/>
+        </w:rPr>
+        <w:t xml:space="preserve">post hoc</w:t>
+      </w:r>
+      <w:r>
+        <w:t xml:space="preserve"> </w:t>
+      </w:r>
+      <w:r>
+        <w:t xml:space="preserve">nas predições de amostra única da frente linear, 96 de 527 (18%) passaram no controle de qualidade de pose da Seção 2.7, e a principal causa de falha foi um contato de átomos pesados peptídeo–receptor a menos de 2,2 Å (427 predições; distância mínima mediana 1,85 Å), que os potenciais de inferência usados a partir do E2 devem reduzir.</w:t>
+      </w:r>
+    </w:p>
+    <w:p>
+      <w:pPr>
+        <w:pStyle w:val="BodyText"/>
+      </w:pPr>
+      <w:r>
+        <w:rPr>
           <w:rStyle w:val="Pendente"/>
         </w:rPr>
-        <w:t xml:space="preserve">PENDENTE: Boltz-2 dos 527 candidatos lineares e 543 cíclicos (E1); reprodutibilidade das predições cíclicas frente à primeira rodada (ρ de Spearman e diferença absoluta média da confiança para entradas idênticas); reescore dos dez primeiros com cinco amostras e três sementes (E2); diferença pareada Δ frente a três controles embaralhados (E3); controle de qualidade de pose (E4) e matriz cruzada 8 × 8 do melhor candidato de cada espécie.</w:t>
-      </w:r>
-    </w:p>
-    <w:bookmarkEnd w:id="54"/>
-    <w:bookmarkStart w:id="55" w:name="Xac36dec43ef87c0d8dd6ab8b37eec853ef28fce"/>
+        <w:t xml:space="preserve">PENDENTE: reescore dos dez melhores por espécie e frente com cinco amostras e três sementes (E2); diferença pareada Δ frente a três controles embaralhados (E3); controle de qualidade de pose (E4) nas estruturas iniciais selecionadas, incluindo quantos candidatos têm ao menos uma amostra que passa, e a matriz cruzada 8 × 8 do melhor candidato de cada espécie.</w:t>
+      </w:r>
+    </w:p>
+    <w:p>
+      <w:pPr>
+        <w:pStyle w:val="CaptionedFigure"/>
+      </w:pPr>
+      <w:r>
+        <w:drawing>
+          <wp:inline>
+            <wp:extent cx="5334000" cy="2414336"/>
+            <wp:effectExtent b="0" l="0" r="0" t="0"/>
+            <wp:docPr descr="Figura 8. Reprodutibilidade da confiança do Boltz-2 na triagem de duas frentes. (A) Os mesmos 442 candidatos cíclicos preditos na primeira rodada e de novo na triagem de duas frentes, com entrada idêntica. (B) As mesmas 527 sequências preditas como peptídeos cíclicos e lineares. A linha pontilhada é a identidade; ρ é a correlação de Spearman e |Δ| a diferença absoluta média." title="" id="55" name="Picture"/>
+            <a:graphic>
+              <a:graphicData uri="http://schemas.openxmlformats.org/drawingml/2006/picture">
+                <pic:pic>
+                  <pic:nvPicPr>
+                    <pic:cNvPr descr="figures/pt/fig8_reprodutibilidade.png" id="56" name="Picture"/>
+                    <pic:cNvPicPr>
+                      <a:picLocks noChangeArrowheads="1" noChangeAspect="1"/>
+                    </pic:cNvPicPr>
+                  </pic:nvPicPr>
+                  <pic:blipFill>
+                    <a:blip r:embed="rId54"/>
+                    <a:stretch>
+                      <a:fillRect/>
+                    </a:stretch>
+                  </pic:blipFill>
+                  <pic:spPr bwMode="auto">
+                    <a:xfrm>
+                      <a:off x="0" y="0"/>
+                      <a:ext cx="5334000" cy="2414336"/>
+                    </a:xfrm>
+                    <a:prstGeom prst="rect">
+                      <a:avLst/>
+                    </a:prstGeom>
+                    <a:noFill/>
+                    <a:ln w="9525">
+                      <a:noFill/>
+                      <a:headEnd/>
+                      <a:tailEnd/>
+                    </a:ln>
+                  </pic:spPr>
+                </pic:pic>
+              </a:graphicData>
+            </a:graphic>
+          </wp:inline>
+        </w:drawing>
+      </w:r>
+    </w:p>
+    <w:p>
+      <w:pPr>
+        <w:pStyle w:val="ImageCaption"/>
+      </w:pPr>
+      <w:r>
+        <w:rPr>
+          <w:b/>
+          <w:bCs/>
+        </w:rPr>
+        <w:t xml:space="preserve">Figura 8.</w:t>
+      </w:r>
+      <w:r>
+        <w:t xml:space="preserve"> </w:t>
+      </w:r>
+      <w:r>
+        <w:t xml:space="preserve">Reprodutibilidade da confiança do Boltz-2 na triagem de duas frentes. (A) Os mesmos 442 candidatos cíclicos preditos na primeira rodada e de novo na triagem de duas frentes, com entrada idêntica. (B) As mesmas 527 sequências preditas como peptídeos cíclicos e lineares. A linha pontilhada é a identidade; ρ é a correlação de Spearman e |Δ| a diferença absoluta média.</w:t>
+      </w:r>
+    </w:p>
+    <w:bookmarkEnd w:id="57"/>
+    <w:bookmarkStart w:id="58" w:name="Xac36dec43ef87c0d8dd6ab8b37eec853ef28fce"/>
     <w:p>
       <w:pPr>
         <w:pStyle w:val="Heading3"/>
@@ -8480,8 +8579,8 @@
         <w:t xml:space="preserve">se nenhum passar.</w:t>
       </w:r>
     </w:p>
-    <w:bookmarkEnd w:id="55"/>
-    <w:bookmarkStart w:id="56" w:name="frente-linear-versus-frente-macrocíclica"/>
+    <w:bookmarkEnd w:id="58"/>
+    <w:bookmarkStart w:id="59" w:name="frente-linear-versus-frente-macrocíclica"/>
     <w:p>
       <w:pPr>
         <w:pStyle w:val="Heading3"/>
@@ -8498,7 +8597,7 @@
         <w:rPr>
           <w:rStyle w:val="Pendente"/>
         </w:rPr>
-        <w:t xml:space="preserve">PENDENTE: sobreposição dos conjuntos de três melhores das duas frentes, correlação de postos da confiança entre modalidades e diferença na ocupância de S1 entre a forma linear e a cíclica da mesma sequência.</w:t>
+        <w:t xml:space="preserve">PENDENTE: sobreposição dos conjuntos finais de três melhores das duas frentes e diferença na ocupância de S1 entre a forma linear e a cíclica da mesma sequência.</w:t>
       </w:r>
     </w:p>
     <w:p>
@@ -8508,9 +8607,9 @@
         </w:pict>
       </w:r>
     </w:p>
-    <w:bookmarkEnd w:id="56"/>
-    <w:bookmarkEnd w:id="57"/>
-    <w:bookmarkStart w:id="63" w:name="discussão"/>
+    <w:bookmarkEnd w:id="59"/>
+    <w:bookmarkEnd w:id="60"/>
+    <w:bookmarkStart w:id="66" w:name="discussão"/>
     <w:p>
       <w:pPr>
         <w:pStyle w:val="Heading2"/>
@@ -8519,7 +8618,7 @@
         <w:t xml:space="preserve">4 Discussão</w:t>
       </w:r>
     </w:p>
-    <w:bookmarkStart w:id="58" w:name="principais-achados"/>
+    <w:bookmarkStart w:id="61" w:name="principais-achados"/>
     <w:p>
       <w:pPr>
         <w:pStyle w:val="Heading3"/>
@@ -8585,8 +8684,8 @@
         <w:t xml:space="preserve">menos do que o inibidor de Kunitz da soja, o que seus autores atribuíram à menor flexibilidade e a um aumento evolutivo da hidrofobicidade dos subsítios (Patarroyo-Vargas et al., 2020).</w:t>
       </w:r>
     </w:p>
-    <w:bookmarkEnd w:id="58"/>
-    <w:bookmarkStart w:id="59" w:name="Xe3615bf2ba7667c30e4492e0c2fa08d640e849c"/>
+    <w:bookmarkEnd w:id="61"/>
+    <w:bookmarkStart w:id="62" w:name="Xe3615bf2ba7667c30e4492e0c2fa08d640e849c"/>
     <w:p>
       <w:pPr>
         <w:pStyle w:val="Heading3"/>
@@ -8619,8 +8718,16 @@
         <w:t xml:space="preserve">Um ponto metodológico merece ênfase. Moléculas separadas de receptor e de ligante podem ser gravadas em imagens periódicas diferentes da caixa de simulação; em um de nossos sistemas, a distância entre os centros de massa do receptor e do peptídeo chegou a 94,8 Å em uma caixa de 116 Å enquanto as duas moléculas estavam em contato em todos os quadros. Qualquer análise de RMSD ou de contatos de simulações proteína–peptídeo que não corrija isso relatará o deslocamento da imagem da caixa como instabilidade, e a correção deve ser verificada explicitamente quando uma triagem depende dessas métricas.</w:t>
       </w:r>
     </w:p>
-    <w:bookmarkEnd w:id="59"/>
-    <w:bookmarkStart w:id="60" w:name="Xafece074cecce80077a0c9860132a7cfb8c9c03"/>
+    <w:p>
+      <w:pPr>
+        <w:pStyle w:val="BodyText"/>
+      </w:pPr>
+      <w:r>
+        <w:t xml:space="preserve">A correlação de postos de 0,57 entre rodadas (Seção 3.8) acrescenta outro limite. Uma única predição do Boltz-2 para um peptídeo curto é um ordenador ruidoso mesmo com entrada idêntica, de modo que diferenças de poucos centésimos na confiança, que separam muitos candidatos, não devem ser interpretadas, e a concordância entre as formas linear e cíclica (ρ = 0,50) não pode ser lida como efeito de modalidade enquanto não for comparada a esse teto.</w:t>
+      </w:r>
+    </w:p>
+    <w:bookmarkEnd w:id="62"/>
+    <w:bookmarkStart w:id="63" w:name="Xafece074cecce80077a0c9860132a7cfb8c9c03"/>
     <w:p>
       <w:pPr>
         <w:pStyle w:val="Heading3"/>
@@ -8698,8 +8805,8 @@
         <w:t xml:space="preserve">As regras de motivos também são grosseiras. O escore é uma contagem ponderada de sítios, a regra do tipo elastase sinaliza quatro resíduos comuns (alanina, glicina, serina e valina), a regra do tipo pepsina não é relevante para o intestino de lepidópteros, e uma classe pode mudar com um único sítio (GIFDDIG não tem sítio de tripsina e, ainda assim, é rotulada MARGINAL). O rótulo RESISTENTE é uma previsão computacional de baixa carga de motivos, e não uma medida de estabilidade no intestino médio.</w:t>
       </w:r>
     </w:p>
-    <w:bookmarkEnd w:id="60"/>
-    <w:bookmarkStart w:id="61" w:name="limitações"/>
+    <w:bookmarkEnd w:id="63"/>
+    <w:bookmarkStart w:id="64" w:name="limitações"/>
     <w:p>
       <w:pPr>
         <w:pStyle w:val="Heading3"/>
@@ -8744,11 +8851,11 @@
         <w:t xml:space="preserve"> </w:t>
       </w:r>
       <w:r>
-        <w:t xml:space="preserve">embora o grupo α-amino fosse majoritariamente neutro nesse pH; dez nanossegundos apenas triam e não podem estabelecer estabilidade nem ordenar candidatos. (ix) Os 22 sistemas de calibração foram simulados por 2 ns a partir de uma única estrutura inicial predita cada, e os ligantes da calibração são muito maiores que os candidatos.</w:t>
-      </w:r>
-    </w:p>
-    <w:bookmarkEnd w:id="61"/>
-    <w:bookmarkStart w:id="62" w:name="perspectivas"/>
+        <w:t xml:space="preserve">embora o grupo α-amino fosse majoritariamente neutro nesse pH; dez nanossegundos apenas triam e não podem estabelecer estabilidade nem ordenar candidatos. (ix) Uma única predição do Boltz-2 é um ordenador ruidoso (ρ = 0,57 entre rodadas para entrada idêntica), de modo que a seleção de candidatos para reescore se apoia em um ranking ruidoso. (x) Os 22 sistemas de calibração foram simulados por 2 ns a partir de uma única estrutura inicial predita cada, e os ligantes da calibração são muito maiores que os candidatos.</w:t>
+      </w:r>
+    </w:p>
+    <w:bookmarkEnd w:id="64"/>
+    <w:bookmarkStart w:id="65" w:name="perspectivas"/>
     <w:p>
       <w:pPr>
         <w:pStyle w:val="Heading3"/>
@@ -8781,9 +8888,9 @@
         <w:t xml:space="preserve">e com tripsinas não-alvo, e um ensaio de estabilidade dos candidatos nos mesmos extratos.</w:t>
       </w:r>
     </w:p>
-    <w:bookmarkEnd w:id="62"/>
-    <w:bookmarkEnd w:id="63"/>
-    <w:bookmarkStart w:id="64" w:name="declaração-de-disponibilidade-de-dados"/>
+    <w:bookmarkEnd w:id="65"/>
+    <w:bookmarkEnd w:id="66"/>
+    <w:bookmarkStart w:id="67" w:name="declaração-de-disponibilidade-de-dados"/>
     <w:p>
       <w:pPr>
         <w:pStyle w:val="Heading2"/>
@@ -8809,8 +8916,8 @@
         <w:t xml:space="preserve">PENDENTE: confirmar visibilidade do repositório e DOI de arquivamento (por exemplo Zenodo) antes da submissão.</w:t>
       </w:r>
     </w:p>
-    <w:bookmarkEnd w:id="64"/>
-    <w:bookmarkStart w:id="65" w:name="declaração-de-ética"/>
+    <w:bookmarkEnd w:id="67"/>
+    <w:bookmarkStart w:id="68" w:name="declaração-de-ética"/>
     <w:p>
       <w:pPr>
         <w:pStyle w:val="Heading2"/>
@@ -8827,8 +8934,8 @@
         <w:t xml:space="preserve">Não se aplica. É um estudo computacional; não envolveu animais, participantes humanos nem dados pessoais.</w:t>
       </w:r>
     </w:p>
-    <w:bookmarkEnd w:id="65"/>
-    <w:bookmarkStart w:id="66" w:name="contribuições-dos-autores"/>
+    <w:bookmarkEnd w:id="68"/>
+    <w:bookmarkStart w:id="69" w:name="contribuições-dos-autores"/>
     <w:p>
       <w:pPr>
         <w:pStyle w:val="Heading2"/>
@@ -8848,8 +8955,8 @@
         <w:t xml:space="preserve">PENDENTE: a completar pelos autores (papéis CRediT).</w:t>
       </w:r>
     </w:p>
-    <w:bookmarkEnd w:id="66"/>
-    <w:bookmarkStart w:id="67" w:name="financiamento"/>
+    <w:bookmarkEnd w:id="69"/>
+    <w:bookmarkStart w:id="70" w:name="financiamento"/>
     <w:p>
       <w:pPr>
         <w:pStyle w:val="Heading2"/>
@@ -8869,8 +8976,8 @@
         <w:t xml:space="preserve">PENDENTE: a completar pelos autores.</w:t>
       </w:r>
     </w:p>
-    <w:bookmarkEnd w:id="67"/>
-    <w:bookmarkStart w:id="68" w:name="agradecimentos"/>
+    <w:bookmarkEnd w:id="70"/>
+    <w:bookmarkStart w:id="71" w:name="agradecimentos"/>
     <w:p>
       <w:pPr>
         <w:pStyle w:val="Heading2"/>
@@ -8917,8 +9024,8 @@
         <w:t xml:space="preserve">“Usou-se IA generativa (Claude, Anthropic) como assistente para escrever scripts de análise, gerar figuras e redigir e traduzir texto. Os autores conferiram todos os resultados numéricos nos arquivos de saída, conferiram cada referência no Crossref ou PubMed e assumem total responsabilidade pelo conteúdo.”</w:t>
       </w:r>
     </w:p>
-    <w:bookmarkEnd w:id="68"/>
-    <w:bookmarkStart w:id="69" w:name="conflito-de-interesses"/>
+    <w:bookmarkEnd w:id="71"/>
+    <w:bookmarkStart w:id="72" w:name="conflito-de-interesses"/>
     <w:p>
       <w:pPr>
         <w:pStyle w:val="Heading2"/>
@@ -8938,8 +9045,8 @@
         <w:t xml:space="preserve">PENDENTE: a completar pelos autores.</w:t>
       </w:r>
     </w:p>
-    <w:bookmarkEnd w:id="69"/>
-    <w:bookmarkStart w:id="76" w:name="figuras-suplementares"/>
+    <w:bookmarkEnd w:id="72"/>
+    <w:bookmarkStart w:id="79" w:name="figuras-suplementares"/>
     <w:p>
       <w:pPr>
         <w:pStyle w:val="Heading2"/>
@@ -8957,18 +9064,18 @@
           <wp:inline>
             <wp:extent cx="4679999" cy="2092235"/>
             <wp:effectExtent b="0" l="0" r="0" t="0"/>
-            <wp:docPr descr="Figura S1. Triagem por escore de motivos por espécie sob a regra linear-estrita e a circular (porcentagem das sequências de cada espécie por classe)." title="" id="71" name="Picture"/>
+            <wp:docPr descr="Figura S1. Triagem por escore de motivos por espécie sob a regra linear-estrita e a circular (porcentagem das sequências de cada espécie por classe)." title="" id="74" name="Picture"/>
             <a:graphic>
               <a:graphicData uri="http://schemas.openxmlformats.org/drawingml/2006/picture">
                 <pic:pic>
                   <pic:nvPicPr>
-                    <pic:cNvPr descr="figures/pt/figS1_regras_motivo.png" id="72" name="Picture"/>
+                    <pic:cNvPr descr="figures/pt/figS1_regras_motivo.png" id="75" name="Picture"/>
                     <pic:cNvPicPr>
                       <a:picLocks noChangeArrowheads="1" noChangeAspect="1"/>
                     </pic:cNvPicPr>
                   </pic:nvPicPr>
                   <pic:blipFill>
-                    <a:blip r:embed="rId70"/>
+                    <a:blip r:embed="rId73"/>
                     <a:stretch>
                       <a:fillRect/>
                     </a:stretch>
@@ -9022,18 +9129,18 @@
           <wp:inline>
             <wp:extent cx="3959999" cy="1583999"/>
             <wp:effectExtent b="0" l="0" r="0" t="0"/>
-            <wp:docPr descr="Figura S2. Teste de fumaça da topologia cíclica: RMSD do esqueleto e número de ligações de hidrogênio do sistema durante 50 ps de simulação de um macrociclo de 10 resíduos (GRPGIQAAPI) com um modelo de receptor de A. gemmatalis em pH 10,0. O teste verifica a montagem (C–N de fechamento 1,34 Å, ω −179°) e nada diz sobre estabilidade." title="" id="74" name="Picture"/>
+            <wp:docPr descr="Figura S2. Teste de fumaça da topologia cíclica: RMSD do esqueleto e número de ligações de hidrogênio do sistema durante 50 ps de simulação de um macrociclo de 10 resíduos (GRPGIQAAPI) com um modelo de receptor de A. gemmatalis em pH 10,0. O teste verifica a montagem (C–N de fechamento 1,34 Å, ω −179°) e nada diz sobre estabilidade." title="" id="77" name="Picture"/>
             <a:graphic>
               <a:graphicData uri="http://schemas.openxmlformats.org/drawingml/2006/picture">
                 <pic:pic>
                   <pic:nvPicPr>
-                    <pic:cNvPr descr="figures/pt/figS2_ciclica_fumaca.png" id="75" name="Picture"/>
+                    <pic:cNvPr descr="figures/pt/figS2_ciclica_fumaca.png" id="78" name="Picture"/>
                     <pic:cNvPicPr>
                       <a:picLocks noChangeArrowheads="1" noChangeAspect="1"/>
                     </pic:cNvPicPr>
                   </pic:nvPicPr>
                   <pic:blipFill>
-                    <a:blip r:embed="rId73"/>
+                    <a:blip r:embed="rId76"/>
                     <a:stretch>
                       <a:fillRect/>
                     </a:stretch>
@@ -9094,8 +9201,8 @@
         <w:t xml:space="preserve">em pH 10,0. O teste verifica a montagem (C–N de fechamento 1,34 Å, ω −179°) e nada diz sobre estabilidade.</w:t>
       </w:r>
     </w:p>
-    <w:bookmarkEnd w:id="76"/>
-    <w:bookmarkStart w:id="77" w:name="referências"/>
+    <w:bookmarkEnd w:id="79"/>
+    <w:bookmarkStart w:id="80" w:name="referências"/>
     <w:p>
       <w:pPr>
         <w:pStyle w:val="Heading2"/>
@@ -9173,6 +9280,14 @@
         <w:pStyle w:val="BodyText"/>
       </w:pPr>
       <w:r>
+        <w:t xml:space="preserve">de Almeida Barros R, Meriño-Cabrera Y, Castro JS, da Silva Junior NR, de Oliveira JVA, Schultz H, et al. (2022). Bovine pancreatic trypsin inhibitor and soybean Kunitz trypsin inhibitor: Differential effects on proteases and larval development of the soybean pest Anticarsia gemmatalis (Lepidoptera: Noctuidae). Pesticide Biochemistry and Physiology 187, 105188. doi: 10.1016/j.pestbp.2022.105188</w:t>
+      </w:r>
+    </w:p>
+    <w:p>
+      <w:pPr>
+        <w:pStyle w:val="BodyText"/>
+      </w:pPr>
+      <w:r>
         <w:t xml:space="preserve">de Almeida Barros R, Meriño-Cabrera Y, Severiche Castro JG, Rodrigues da Silva Júnior N, Schultz H, de Andrade RJ, et al. (2022). Inhibition constant and stability of tripeptide inhibitors of gut trypsin-like enzyme of the soybean pest Anticarsia gemmatalis. Archives of Insect Biochemistry and Physiology 110, e21887. doi: 10.1002/arch.21887</w:t>
       </w:r>
     </w:p>
@@ -9181,7 +9296,7 @@
         <w:pStyle w:val="BodyText"/>
       </w:pPr>
       <w:r>
-        <w:t xml:space="preserve">de Almeida Barros R, Meriño-Cabrera Y, Castro JS, da Silva Junior NR, de Oliveira JVA, Schultz H, et al. (2022). Bovine pancreatic trypsin inhibitor and soybean Kunitz trypsin inhibitor: Differential effects on proteases and larval development of the soybean pest Anticarsia gemmatalis (Lepidoptera: Noctuidae). Pesticide Biochemistry and Physiology 187, 105188. doi: 10.1016/j.pestbp.2022.105188</w:t>
+        <w:t xml:space="preserve">Dolinsky TJ, Czodrowski P, Li H, Nielsen JE, Jensen JH, Klebe G, et al. (2007). PDB2PQR: expanding and upgrading automated preparation of biomolecular structures for molecular simulations. Nucleic Acids Research 35, W522-W525. doi: 10.1093/nar/gkm276</w:t>
       </w:r>
     </w:p>
     <w:p>
@@ -9189,7 +9304,7 @@
         <w:pStyle w:val="BodyText"/>
       </w:pPr>
       <w:r>
-        <w:t xml:space="preserve">Dolinsky TJ, Czodrowski P, Li H, Nielsen JE, Jensen JH, Klebe G, et al. (2007). PDB2PQR: expanding and upgrading automated preparation of biomolecular structures for molecular simulations. Nucleic Acids Research 35, W522-W525. doi: 10.1093/nar/gkm276</w:t>
+        <w:t xml:space="preserve">Dow JAT (1992). pH gradients in lepidopteran midgut. Journal of Experimental Biology 172, 355-375. doi: 10.1242/jeb.172.1.355</w:t>
       </w:r>
     </w:p>
     <w:p>
@@ -9197,7 +9312,7 @@
         <w:pStyle w:val="BodyText"/>
       </w:pPr>
       <w:r>
-        <w:t xml:space="preserve">Dow JAT (1992). pH gradients in lepidopteran midgut. Journal of Experimental Biology 172, 355-375. doi: 10.1242/jeb.172.1.355</w:t>
+        <w:t xml:space="preserve">Essmann U, Perera L, Berkowitz ML, Darden T, Lee H, Pedersen LG (1995). A smooth particle mesh Ewald method. The Journal of Chemical Physics 103, 8577-8593. doi: 10.1063/1.470117</w:t>
       </w:r>
     </w:p>
     <w:p>
@@ -9205,7 +9320,7 @@
         <w:pStyle w:val="BodyText"/>
       </w:pPr>
       <w:r>
-        <w:t xml:space="preserve">Essmann U, Perera L, Berkowitz ML, Darden T, Lee H, Pedersen LG (1995). A smooth particle mesh Ewald method. The Journal of Chemical Physics 103, 8577-8593. doi: 10.1063/1.470117</w:t>
+        <w:t xml:space="preserve">Gasteiger E, Hoogland C, Gattiker A, Duvaud S, Wilkins MR, Appel RD, et al. (2005). Protein Identification and Analysis Tools on the ExPASy Server. The Proteomics Protocols Handbook , 571-607. doi: 10.1385/1-59259-890-0:571</w:t>
       </w:r>
     </w:p>
     <w:p>
@@ -9213,7 +9328,7 @@
         <w:pStyle w:val="BodyText"/>
       </w:pPr>
       <w:r>
-        <w:t xml:space="preserve">Gasteiger E, Hoogland C, Gattiker A, Duvaud S, Wilkins MR, Appel RD, et al. (2005). Protein Identification and Analysis Tools on the ExPASy Server. The Proteomics Protocols Handbook , 571-607. doi: 10.1385/1-59259-890-0:571</w:t>
+        <w:t xml:space="preserve">Genheden S, Ryde U (2015). The MM/PBSA and MM/GBSA methods to estimate ligand-binding affinities. Expert Opinion on Drug Discovery 10, 449-461. doi: 10.1517/17460441.2015.1032936</w:t>
       </w:r>
     </w:p>
     <w:p>
@@ -9221,7 +9336,7 @@
         <w:pStyle w:val="BodyText"/>
       </w:pPr>
       <w:r>
-        <w:t xml:space="preserve">Genheden S, Ryde U (2015). The MM/PBSA and MM/GBSA methods to estimate ligand-binding affinities. Expert Opinion on Drug Discovery 10, 449-461. doi: 10.1517/17460441.2015.1032936</w:t>
+        <w:t xml:space="preserve">Gowers R, Linke M, Barnoud J, Reddy T, Melo M, Seyler S, et al. (2016). MDAnalysis: A Python Package for the Rapid Analysis of Molecular Dynamics Simulations. Proceedings of the Python in Science Conference , 98-105. doi: 10.25080/majora-629e541a-00e</w:t>
       </w:r>
     </w:p>
     <w:p>
@@ -9229,7 +9344,7 @@
         <w:pStyle w:val="BodyText"/>
       </w:pPr>
       <w:r>
-        <w:t xml:space="preserve">Gowers R, Linke M, Barnoud J, Reddy T, Melo M, Seyler S, et al. (2016). MDAnalysis: A Python Package for the Rapid Analysis of Molecular Dynamics Simulations. Proceedings of the Python in Science Conference , 98-105. doi: 10.25080/majora-629e541a-00e</w:t>
+        <w:t xml:space="preserve">Hedstrom L (2002). Serine Protease Mechanism and Specificity. Chemical Reviews 102, 4501-4524. doi: 10.1021/cr000033x</w:t>
       </w:r>
     </w:p>
     <w:p>
@@ -9237,7 +9352,7 @@
         <w:pStyle w:val="BodyText"/>
       </w:pPr>
       <w:r>
-        <w:t xml:space="preserve">Hedstrom L (2002). Serine Protease Mechanism and Specificity. Chemical Reviews 102, 4501-4524. doi: 10.1021/cr000033x</w:t>
+        <w:t xml:space="preserve">Hou T, Wang J, Li Y, Wang W (2011). Assessing the Performance of the MM/PBSA and MM/GBSA Methods. 1. The Accuracy of Binding Free Energy Calculations Based on Molecular Dynamics Simulations. Journal of Chemical Information and Modeling 51, 69-82. doi: 10.1021/ci100275a</w:t>
       </w:r>
     </w:p>
     <w:p>
@@ -9245,7 +9360,7 @@
         <w:pStyle w:val="BodyText"/>
       </w:pPr>
       <w:r>
-        <w:t xml:space="preserve">Hou T, Wang J, Li Y, Wang W (2011). Assessing the Performance of the MM/PBSA and MM/GBSA Methods. 1. The Accuracy of Binding Free Energy Calculations Based on Molecular Dynamics Simulations. Journal of Chemical Information and Modeling 51, 69-82. doi: 10.1021/ci100275a</w:t>
+        <w:t xml:space="preserve">Jongsma MA, Bakker PL, Peters J, Bosch D, Stiekema WJ (1995). Adaptation of Spodoptera exigua larvae to plant proteinase inhibitors by induction of gut proteinase activity insensitive to inhibition. Proceedings of the National Academy of Sciences 92, 8041-8045. doi: 10.1073/pnas.92.17.8041</w:t>
       </w:r>
     </w:p>
     <w:p>
@@ -9253,7 +9368,7 @@
         <w:pStyle w:val="BodyText"/>
       </w:pPr>
       <w:r>
-        <w:t xml:space="preserve">Jongsma MA, Bakker PL, Peters J, Bosch D, Stiekema WJ (1995). Adaptation of Spodoptera exigua larvae to plant proteinase inhibitors by induction of gut proteinase activity insensitive to inhibition. Proceedings of the National Academy of Sciences 92, 8041-8045. doi: 10.1073/pnas.92.17.8041</w:t>
+        <w:t xml:space="preserve">Jongsma MA, Bolter C (1997). The adaptation of insects to plant protease inhibitors. Journal of Insect Physiology 43, 885-895. doi: 10.1016/s0022-1910(97)00040-1</w:t>
       </w:r>
     </w:p>
     <w:p>
@@ -9261,7 +9376,7 @@
         <w:pStyle w:val="BodyText"/>
       </w:pPr>
       <w:r>
-        <w:t xml:space="preserve">Jongsma MA, Bolter C (1997). The adaptation of insects to plant protease inhibitors. Journal of Insect Physiology 43, 885-895. doi: 10.1016/s0022-1910(97)00040-1</w:t>
+        <w:t xml:space="preserve">Jorgensen WL, Chandrasekhar J, Madura JD, Impey RW, Klein ML (1983). Comparison of simple potential functions for simulating liquid water. The Journal of Chemical Physics 79, 926-935. doi: 10.1063/1.445869</w:t>
       </w:r>
     </w:p>
     <w:p>
@@ -9269,7 +9384,7 @@
         <w:pStyle w:val="BodyText"/>
       </w:pPr>
       <w:r>
-        <w:t xml:space="preserve">Jorgensen WL, Chandrasekhar J, Madura JD, Impey RW, Klein ML (1983). Comparison of simple potential functions for simulating liquid water. The Journal of Chemical Physics 79, 926-935. doi: 10.1063/1.445869</w:t>
+        <w:t xml:space="preserve">Jumper J, Evans R, Pritzel A, Green T, Figurnov M, Ronneberger O, et al. (2021). Highly accurate protein structure prediction with AlphaFold. Nature 596, 583-589. doi: 10.1038/s41586-021-03819-2</w:t>
       </w:r>
     </w:p>
     <w:p>
@@ -9277,7 +9392,7 @@
         <w:pStyle w:val="BodyText"/>
       </w:pPr>
       <w:r>
-        <w:t xml:space="preserve">Jumper J, Evans R, Pritzel A, Green T, Figurnov M, Ronneberger O, et al. (2021). Highly accurate protein structure prediction with AlphaFold. Nature 596, 583-589. doi: 10.1038/s41586-021-03819-2</w:t>
+        <w:t xml:space="preserve">Karumbaiah L, Oppert B, Jurat-Fuentes JL, Adang MJ (2007). Analysis of midgut proteinases from Bacillus thuringiensis-susceptible and -resistant Heliothis virescens (Lepidoptera: Noctuidae). Comparative Biochemistry and Physiology Part B: Biochemistry and Molecular Biology 146, 139-146. doi: 10.1016/j.cbpb.2006.10.104</w:t>
       </w:r>
     </w:p>
     <w:p>
@@ -9285,7 +9400,7 @@
         <w:pStyle w:val="BodyText"/>
       </w:pPr>
       <w:r>
-        <w:t xml:space="preserve">Karumbaiah L, Oppert B, Jurat-Fuentes JL, Adang MJ (2007). Analysis of midgut proteinases from Bacillus thuringiensis-susceptible and -resistant Heliothis virescens (Lepidoptera: Noctuidae). Comparative Biochemistry and Physiology Part B: Biochemistry and Molecular Biology 146, 139-146. doi: 10.1016/j.cbpb.2006.10.104</w:t>
+        <w:t xml:space="preserve">Kelly C, Laskowski Jr. M, Qasim M (2005). The Role of Scaffolding in Standard Mechanism Serine Proteinase Inhibitors. Protein &amp; Peptide Letters 12, 465-471. doi: 10.2174/0929866054395383</w:t>
       </w:r>
     </w:p>
     <w:p>
@@ -9293,7 +9408,7 @@
         <w:pStyle w:val="BodyText"/>
       </w:pPr>
       <w:r>
-        <w:t xml:space="preserve">Kelly C, Laskowski Jr. M, Qasim M (2005). The Role of Scaffolding in Standard Mechanism Serine Proteinase Inhibitors. Protein &amp; Peptide Letters 12, 465-471. doi: 10.2174/0929866054395383</w:t>
+        <w:t xml:space="preserve">Kuwar SS, Pauchet Y, Vogel H, Heckel DG (2015). Adaptive regulation of digestive serine proteases in the larval midgut of Helicoverpa armigera in response to a plant protease inhibitor. Insect Biochemistry and Molecular Biology 59, 18-29. doi: 10.1016/j.ibmb.2015.01.016</w:t>
       </w:r>
     </w:p>
     <w:p>
@@ -9301,7 +9416,7 @@
         <w:pStyle w:val="BodyText"/>
       </w:pPr>
       <w:r>
-        <w:t xml:space="preserve">Kuwar SS, Pauchet Y, Vogel H, Heckel DG (2015). Adaptive regulation of digestive serine proteases in the larval midgut of Helicoverpa armigera in response to a plant protease inhibitor. Insect Biochemistry and Molecular Biology 59, 18-29. doi: 10.1016/j.ibmb.2015.01.016</w:t>
+        <w:t xml:space="preserve">Laskowski M, Kato I (1980). Protein Inhibitors of Proteinases. Annual Review of Biochemistry 49, 593-626. doi: 10.1146/annurev.bi.49.070180.003113</w:t>
       </w:r>
     </w:p>
     <w:p>
@@ -9309,7 +9424,7 @@
         <w:pStyle w:val="BodyText"/>
       </w:pPr>
       <w:r>
-        <w:t xml:space="preserve">Laskowski M, Kato I (1980). Protein Inhibitors of Proteinases. Annual Review of Biochemistry 49, 593-626. doi: 10.1146/annurev.bi.49.070180.003113</w:t>
+        <w:t xml:space="preserve">Laskowski M, Qasim M (2000). What can the structures of enzyme-inhibitor complexes tell us about the structures of enzyme substrate complexes?. Biochimica et Biophysica Acta (BBA) - Protein Structure and Molecular Enzymology 1477, 324-337. doi: 10.1016/s0167-4838(99)00284-8</w:t>
       </w:r>
     </w:p>
     <w:p>
@@ -9317,7 +9432,7 @@
         <w:pStyle w:val="BodyText"/>
       </w:pPr>
       <w:r>
-        <w:t xml:space="preserve">Laskowski M, Qasim M (2000). What can the structures of enzyme-inhibitor complexes tell us about the structures of enzyme substrate complexes?. Biochimica et Biophysica Acta (BBA) - Protein Structure and Molecular Enzymology 1477, 324-337. doi: 10.1016/s0167-4838(99)00284-8</w:t>
+        <w:t xml:space="preserve">Lindorff-Larsen K, Piana S, Palmo K, Maragakis P, Klepeis JL, Dror RO, et al. (2010). Improved side-chain torsion potentials for the Amber ff99SB protein force field. Proteins: Structure, Function, and Bioinformatics 78, 1950-1958. doi: 10.1002/prot.22711</w:t>
       </w:r>
     </w:p>
     <w:p>
@@ -9325,7 +9440,7 @@
         <w:pStyle w:val="BodyText"/>
       </w:pPr>
       <w:r>
-        <w:t xml:space="preserve">Lindorff-Larsen K, Piana S, Palmo K, Maragakis P, Klepeis JL, Dror RO, et al. (2010). Improved side-chain torsion potentials for the Amber ff99SB protein force field. Proteins: Structure, Function, and Bioinformatics 78, 1950-1958. doi: 10.1002/prot.22711</w:t>
+        <w:t xml:space="preserve">Lomate PR, Dewangan V, Mahajan NS, Kumar Y, Kulkarni A, Wang L, et al. (2018). Integrated Transcriptomic and Proteomic Analyses Suggest the Participation of Endogenous Protease Inhibitors in the Regulation of Protease Gene Expression in Helicoverpa armigera. Molecular &amp; Cellular Proteomics 17, 1324-1336. doi: 10.1074/mcp.ra117.000533</w:t>
       </w:r>
     </w:p>
     <w:p>
@@ -9333,7 +9448,7 @@
         <w:pStyle w:val="BodyText"/>
       </w:pPr>
       <w:r>
-        <w:t xml:space="preserve">Lomate PR, Dewangan V, Mahajan NS, Kumar Y, Kulkarni A, Wang L, et al. (2018). Integrated Transcriptomic and Proteomic Analyses Suggest the Participation of Endogenous Protease Inhibitors in the Regulation of Protease Gene Expression in Helicoverpa armigera. Molecular &amp; Cellular Proteomics 17, 1324-1336. doi: 10.1074/mcp.ra117.000533</w:t>
+        <w:t xml:space="preserve">Luckett S, Garcia R, Barker J, Konarev A, Shewry P, Clarke A, et al. (1999). High-resolution structure of a potent, cyclic proteinase inhibitor from sunflower seeds. Journal of Molecular Biology 290, 525-533. doi: 10.1006/jmbi.1999.2891</w:t>
       </w:r>
     </w:p>
     <w:p>
@@ -9341,7 +9456,7 @@
         <w:pStyle w:val="BodyText"/>
       </w:pPr>
       <w:r>
-        <w:t xml:space="preserve">Luckett S, Garcia R, Barker J, Konarev A, Shewry P, Clarke A, et al. (1999). High-resolution structure of a potent, cyclic proteinase inhibitor from sunflower seeds. Journal of Molecular Biology 290, 525-533. doi: 10.1006/jmbi.1999.2891</w:t>
+        <w:t xml:space="preserve">Meriño-Cabrera Y, de Oliveira Mendes TA, Castro JGS, Barbosa SL, Macedo MLR, de Almeida Oliveira MG (2020). Noncompetitive tight-binding inhibition of Anticarsia gemmatalis trypsins by Adenanthera pavonina protease inhibitor affects larvae survival. Archives of Insect Biochemistry and Physiology 104, e21687. doi: 10.1002/arch.21687</w:t>
       </w:r>
     </w:p>
     <w:p>
@@ -9349,7 +9464,7 @@
         <w:pStyle w:val="BodyText"/>
       </w:pPr>
       <w:r>
-        <w:t xml:space="preserve">Meriño-Cabrera Y, de Oliveira Mendes TA, Castro JGS, Barbosa SL, Macedo MLR, de Almeida Oliveira MG (2020). Noncompetitive tight-binding inhibition of Anticarsia gemmatalis trypsins by Adenanthera pavonina protease inhibitor affects larvae survival. Archives of Insect Biochemistry and Physiology 104, e21687. doi: 10.1002/arch.21687</w:t>
+        <w:t xml:space="preserve">Meriño-Cabrera Y, Severiche Castro JG, Rios Diez JD, Rodrigues Macedo ML, de Oliveira Mendes TA, Goreti de Almeida Oliveira M (2020). Rational design of mimetic peptides based on the interaction between Inga laurina inhibitor and trypsins for Spodoptera cosmioides pest control. Insect Biochemistry and Molecular Biology 122, 103390. doi: 10.1016/j.ibmb.2020.103390</w:t>
       </w:r>
     </w:p>
     <w:p>
@@ -9357,7 +9472,7 @@
         <w:pStyle w:val="BodyText"/>
       </w:pPr>
       <w:r>
-        <w:t xml:space="preserve">Meriño-Cabrera Y, Severiche Castro JG, Rios Diez JD, Rodrigues Macedo ML, de Oliveira Mendes TA, Goreti de Almeida Oliveira M (2020). Rational design of mimetic peptides based on the interaction between Inga laurina inhibitor and trypsins for Spodoptera cosmioides pest control. Insect Biochemistry and Molecular Biology 122, 103390. doi: 10.1016/j.ibmb.2020.103390</w:t>
+        <w:t xml:space="preserve">Meriño-Cabrera Y, Castro JS, de Almeida Barros R, da Silva Junior NR, de Oliveira Ramos H, de Almeida Oliveira MG (2022). Arginine-containing dipeptides decrease affinity of gut trypsins and compromise soybean pest development. Pesticide Biochemistry and Physiology 184, 105107. doi: 10.1016/j.pestbp.2022.105107</w:t>
       </w:r>
     </w:p>
     <w:p>
@@ -9365,7 +9480,7 @@
         <w:pStyle w:val="BodyText"/>
       </w:pPr>
       <w:r>
-        <w:t xml:space="preserve">Meriño-Cabrera Y, Castro JS, de Almeida Barros R, da Silva Junior NR, de Oliveira Ramos H, de Almeida Oliveira MG (2022). Arginine-containing dipeptides decrease affinity of gut trypsins and compromise soybean pest development. Pesticide Biochemistry and Physiology 184, 105107. doi: 10.1016/j.pestbp.2022.105107</w:t>
+        <w:t xml:space="preserve">Michaud-Agrawal N, Denning EJ, Woolf TB, Beckstein O (2011). MDAnalysis: A toolkit for the analysis of molecular dynamics simulations. Journal of Computational Chemistry 32, 2319-2327. doi: 10.1002/jcc.21787</w:t>
       </w:r>
     </w:p>
     <w:p>
@@ -9373,7 +9488,7 @@
         <w:pStyle w:val="BodyText"/>
       </w:pPr>
       <w:r>
-        <w:t xml:space="preserve">Michaud-Agrawal N, Denning EJ, Woolf TB, Beckstein O (2011). MDAnalysis: A toolkit for the analysis of molecular dynamics simulations. Journal of Computational Chemistry 32, 2319-2327. doi: 10.1002/jcc.21787</w:t>
+        <w:t xml:space="preserve">Mirdita M, Schütze K, Moriwaki Y, Heo L, Ovchinnikov S, Steinegger M (2022). ColabFold: making protein folding accessible to all. Nature Methods 19, 679-682. doi: 10.1038/s41592-022-01488-1</w:t>
       </w:r>
     </w:p>
     <w:p>
@@ -9381,7 +9496,7 @@
         <w:pStyle w:val="BodyText"/>
       </w:pPr>
       <w:r>
-        <w:t xml:space="preserve">Mirdita M, Schütze K, Moriwaki Y, Heo L, Ovchinnikov S, Steinegger M (2022). ColabFold: making protein folding accessible to all. Nature Methods 19, 679-682. doi: 10.1038/s41592-022-01488-1</w:t>
+        <w:t xml:space="preserve">Nakonieczny M, Michalczyk K, Kędziorski A (2007). Midgut protease activities in monophagous larvae of Apollo butterfly, Parnassius apollo ssp. frankenbergeri. Comptes Rendus. Biologies 330, 126-134. doi: 10.1016/j.crvi.2006.12.002</w:t>
       </w:r>
     </w:p>
     <w:p>
@@ -9389,7 +9504,7 @@
         <w:pStyle w:val="BodyText"/>
       </w:pPr>
       <w:r>
-        <w:t xml:space="preserve">Nakonieczny M, Michalczyk K, Kędziorski A (2007). Midgut protease activities in monophagous larvae of Apollo butterfly, Parnassius apollo ssp. frankenbergeri. Comptes Rendus. Biologies 330, 126-134. doi: 10.1016/j.crvi.2006.12.002</w:t>
+        <w:t xml:space="preserve">Olsson MHM, Søndergaard CR, Rostkowski M, Jensen JH (2011). PROPKA3: Consistent Treatment of Internal and Surface Residues in Empirical p K a Predictions. Journal of Chemical Theory and Computation 7, 525-537. doi: 10.1021/ct100578z</w:t>
       </w:r>
     </w:p>
     <w:p>
@@ -9397,7 +9512,7 @@
         <w:pStyle w:val="BodyText"/>
       </w:pPr>
       <w:r>
-        <w:t xml:space="preserve">Olsson MHM, Søndergaard CR, Rostkowski M, Jensen JH (2011). PROPKA3: Consistent Treatment of Internal and Surface Residues in Empirical p K a Predictions. Journal of Chemical Theory and Computation 7, 525-537. doi: 10.1021/ct100578z</w:t>
+        <w:t xml:space="preserve">Parkin S, Rupp B, Hope H (1996). Structure of bovine pancreatic trypsin inhibitor at 125 K definition of carboxyl-terminal residues Gly57 and Ala58. Acta Crystallographica Section D Biological Crystallography 52, 18-29. doi: 10.1107/S0907444995008675</w:t>
       </w:r>
     </w:p>
     <w:p>
@@ -9405,7 +9520,7 @@
         <w:pStyle w:val="BodyText"/>
       </w:pPr>
       <w:r>
-        <w:t xml:space="preserve">Parkin S, Rupp B, Hope H (1996). Structure of bovine pancreatic trypsin inhibitor at 125 K definition of carboxyl-terminal residues Gly57 and Ala58. Acta Crystallographica Section D Biological Crystallography 52, 18-29. doi: 10.1107/S0907444995008675</w:t>
+        <w:t xml:space="preserve">Parrinello M, Rahman A (1981). Polymorphic transitions in single crystals: A new molecular dynamics method. Journal of Applied Physics 52, 7182-7190. doi: 10.1063/1.328693</w:t>
       </w:r>
     </w:p>
     <w:p>
@@ -9413,7 +9528,7 @@
         <w:pStyle w:val="BodyText"/>
       </w:pPr>
       <w:r>
-        <w:t xml:space="preserve">Parrinello M, Rahman A (1981). Polymorphic transitions in single crystals: A new molecular dynamics method. Journal of Applied Physics 52, 7182-7190. doi: 10.1063/1.328693</w:t>
+        <w:t xml:space="preserve">Passaro S, Corso G, Wohlwend J, Reveiz M, Thaler S, Ram Somnath V, et al. (2025). Boltz-2: Towards accurate and efficient binding affinity prediction. bioRxiv [Preprint]. doi: 10.1101/2025.06.14.659707</w:t>
       </w:r>
     </w:p>
     <w:p>
@@ -9421,7 +9536,7 @@
         <w:pStyle w:val="BodyText"/>
       </w:pPr>
       <w:r>
-        <w:t xml:space="preserve">Passaro S, Corso G, Wohlwend J, Reveiz M, Thaler S, Ram Somnath V, et al. (2025). Boltz-2: Towards accurate and efficient binding affinity prediction. bioRxiv [Preprint]. doi: 10.1101/2025.06.14.659707</w:t>
+        <w:t xml:space="preserve">Patarroyo-Vargas AM, Merino-Cabrera YB, Zanuncio JC, Rocha F, Campos WG, de Almeida Oliveira MG (2017). Kinetic Characterization of Anticarsia gemmatalis Digestive Serine- Proteases and the Inhibitory Effect of Synthetic Peptides. Protein &amp; Peptide Letters 24, 1040-1047. doi: 10.2174/0929866524666170918103146</w:t>
       </w:r>
     </w:p>
     <w:p>
@@ -9429,7 +9544,7 @@
         <w:pStyle w:val="BodyText"/>
       </w:pPr>
       <w:r>
-        <w:t xml:space="preserve">Patarroyo-Vargas AM, Merino-Cabrera YB, Zanuncio JC, Rocha F, Campos WG, de Almeida Oliveira MG (2017). Kinetic Characterization of Anticarsia gemmatalis Digestive Serine- Proteases and the Inhibitory Effect of Synthetic Peptides. Protein &amp; Peptide Letters 24, 1040-1047. doi: 10.2174/0929866524666170918103146</w:t>
+        <w:t xml:space="preserve">Patarroyo-Vargas AM, Cordeiro G, Silva CRD, Silva CRD, Mendonça EG, Visôtto LE, et al. (2020). Inhibition kinetics of digestive proteases for Anticarsia gemmatalis. Anais da Academia Brasileira de Ciências 92, e20180477. doi: 10.1590/0001-3765202020180477</w:t>
       </w:r>
     </w:p>
     <w:p>
@@ -9437,7 +9552,7 @@
         <w:pStyle w:val="BodyText"/>
       </w:pPr>
       <w:r>
-        <w:t xml:space="preserve">Patarroyo-Vargas AM, Cordeiro G, Silva CRD, Silva CRD, Mendonça EG, Visôtto LE, et al. (2020). Inhibition kinetics of digestive proteases for Anticarsia gemmatalis. Anais da Academia Brasileira de Ciências 92, e20180477. doi: 10.1590/0001-3765202020180477</w:t>
+        <w:t xml:space="preserve">Paulo DGS, Schneider JR, Meriño-Cabrera Y, Wurlitzer WB, de Andrade RJ, Santos ILB, et al. (2026). Peptides Derived From Reactive Center Loops Inhibit Digestive Trypsin-Like Enzymes in Lepidopteran Pests. Archives of Insect Biochemistry and Physiology 121, e70123. doi: 10.1002/arch.70123</w:t>
       </w:r>
     </w:p>
     <w:p>
@@ -9445,7 +9560,7 @@
         <w:pStyle w:val="BodyText"/>
       </w:pPr>
       <w:r>
-        <w:t xml:space="preserve">Paulo DGS, Schneider JR, Meriño-Cabrera Y, Wurlitzer WB, de Andrade RJ, Santos ILB, et al. (2026). Peptides Derived From Reactive Center Loops Inhibit Digestive Trypsin-Like Enzymes in Lepidopteran Pests. Archives of Insect Biochemistry and Physiology 121, e70123. doi: 10.1002/arch.70123</w:t>
+        <w:t xml:space="preserve">Perona JJ, Craik CS (1995). Structural basis of substrate specificity in the serine proteases. Protein Science 4, 337-360. doi: 10.1002/pro.5560040301</w:t>
       </w:r>
     </w:p>
     <w:p>
@@ -9453,7 +9568,7 @@
         <w:pStyle w:val="BodyText"/>
       </w:pPr>
       <w:r>
-        <w:t xml:space="preserve">Perona JJ, Craik CS (1995). Structural basis of substrate specificity in the serine proteases. Protein Science 4, 337-360. doi: 10.1002/pro.5560040301</w:t>
+        <w:t xml:space="preserve">Rettie SA, Juergens D, Adebomi V, Bueso YF, Zhao Q, Leveille AN, et al. (2025). Accurate de novo design of high-affinity protein-binding macrocycles using deep learning. Nature Chemical Biology 21, 1948-1956. doi: 10.1038/s41589-025-01929-w</w:t>
       </w:r>
     </w:p>
     <w:p>
@@ -9461,7 +9576,7 @@
         <w:pStyle w:val="BodyText"/>
       </w:pPr>
       <w:r>
-        <w:t xml:space="preserve">Rettie SA, Juergens D, Adebomi V, Bueso YF, Zhao Q, Leveille AN, et al. (2025). Accurate de novo design of high-affinity protein-binding macrocycles using deep learning. Nature Chemical Biology 21, 1948-1956. doi: 10.1038/s41589-025-01929-w</w:t>
+        <w:t xml:space="preserve">Saikhedkar NS, Joshi RS, Bhoite AS, Mohandasan R, Yadav AK, Fernandes M, et al. (2018). Tripeptides derived from reactive centre loop of potato type II protease inhibitors preferentially inhibit midgut proteases of Helicoverpa armigera. Insect Biochemistry and Molecular Biology 95, 17-25. doi: 10.1016/j.ibmb.2018.02.001</w:t>
       </w:r>
     </w:p>
     <w:p>
@@ -9469,7 +9584,7 @@
         <w:pStyle w:val="BodyText"/>
       </w:pPr>
       <w:r>
-        <w:t xml:space="preserve">Saikhedkar NS, Joshi RS, Bhoite AS, Mohandasan R, Yadav AK, Fernandes M, et al. (2018). Tripeptides derived from reactive centre loop of potato type II protease inhibitors preferentially inhibit midgut proteases of Helicoverpa armigera. Insect Biochemistry and Molecular Biology 95, 17-25. doi: 10.1016/j.ibmb.2018.02.001</w:t>
+        <w:t xml:space="preserve">Saikhedkar NS, Joshi RS, Yadav AK, Seal S, Fernandes M, Giri AP (2019). Phyto-inspired cyclic peptides derived from plant Pin-II type protease inhibitor reactive center loops for crop protection from insect pests. Biochimica et Biophysica Acta (BBA) - General Subjects 1863, 1254-1262. doi: 10.1016/j.bbagen.2019.05.003</w:t>
       </w:r>
     </w:p>
     <w:p>
@@ -9477,7 +9592,7 @@
         <w:pStyle w:val="BodyText"/>
       </w:pPr>
       <w:r>
-        <w:t xml:space="preserve">Saikhedkar NS, Joshi RS, Yadav AK, Seal S, Fernandes M, Giri AP (2019). Phyto-inspired cyclic peptides derived from plant Pin-II type protease inhibitor reactive center loops for crop protection from insect pests. Biochimica et Biophysica Acta (BBA) - General Subjects 1863, 1254-1262. doi: 10.1016/j.bbagen.2019.05.003</w:t>
+        <w:t xml:space="preserve">Schechter I, Berger A (1967). On the size of the active site in proteases. I. Papain. Biochemical and Biophysical Research Communications 27, 157-162. doi: 10.1016/S0006-291X(67)80055-X</w:t>
       </w:r>
     </w:p>
     <w:p>
@@ -9485,7 +9600,7 @@
         <w:pStyle w:val="BodyText"/>
       </w:pPr>
       <w:r>
-        <w:t xml:space="preserve">Schechter I, Berger A (1967). On the size of the active site in proteases. I. Papain. Biochemical and Biophysical Research Communications 27, 157-162. doi: 10.1016/S0006-291X(67)80055-X</w:t>
+        <w:t xml:space="preserve">Schultz H, Paulo DGS, Meriño-Cabrera Y, de Andrade RJ, Santos ILB, Rodrigues MCNG, et al. (2026). Synthetic Peptide Inhibition of Trypsin-Like Proteases in Spodoptera frugiperda (Lepidoptera: Noctuidae): Evaluating the Influence of Gut Microbiota. Archives of Insect Biochemistry and Physiology 121, e70145. doi: 10.1002/arch.70145</w:t>
       </w:r>
     </w:p>
     <w:p>
@@ -9493,7 +9608,7 @@
         <w:pStyle w:val="BodyText"/>
       </w:pPr>
       <w:r>
-        <w:t xml:space="preserve">Schultz H, Paulo DGS, Meriño-Cabrera Y, de Andrade RJ, Santos ILB, Rodrigues MCNG, et al. (2026). Synthetic Peptide Inhibition of Trypsin-Like Proteases in Spodoptera frugiperda (Lepidoptera: Noctuidae): Evaluating the Influence of Gut Microbiota. Archives of Insect Biochemistry and Physiology 121, e70145. doi: 10.1002/arch.70145</w:t>
+        <w:t xml:space="preserve">Severiche-Castro J, Valerio MF, Oliveira MGdA (2026). Structure-Guided Design of an Interface-Derived Inhibitor Peptide Against Spodoptera frugiperda Digestive Trypsins. Archives of Insect Biochemistry and Physiology 122, e70164. doi: 10.1002/arch.70164</w:t>
       </w:r>
     </w:p>
     <w:p>
@@ -9501,7 +9616,7 @@
         <w:pStyle w:val="BodyText"/>
       </w:pPr>
       <w:r>
-        <w:t xml:space="preserve">Severiche-Castro J, Valerio MF, Oliveira MGdA (2026). Structure-Guided Design of an Interface-Derived Inhibitor Peptide Against Spodoptera frugiperda Digestive Trypsins. Archives of Insect Biochemistry and Physiology 122, e70164. doi: 10.1002/arch.70164</w:t>
+        <w:t xml:space="preserve">Silva-Júnior NR, Cabrera YM, Barbosa SL, Barros RDA, Barros E, Vital CE, et al. (2021). Intestinal proteases profiling from Anticarsia gemmatalis and their binding to inhibitors. Archives of Insect Biochemistry and Physiology 107, e21792. doi: 10.1002/arch.21792</w:t>
       </w:r>
     </w:p>
     <w:p>
@@ -9509,7 +9624,7 @@
         <w:pStyle w:val="BodyText"/>
       </w:pPr>
       <w:r>
-        <w:t xml:space="preserve">Silva-Júnior NR, Cabrera YM, Barbosa SL, Barros RDA, Barros E, Vital CE, et al. (2021). Intestinal proteases profiling from Anticarsia gemmatalis and their binding to inhibitors. Archives of Insect Biochemistry and Physiology 107, e21792. doi: 10.1002/arch.21792</w:t>
+        <w:t xml:space="preserve">Song HK, Suh SW (1998). Kunitz-type soybean trypsin inhibitor revisited: refined structure of its complex with porcine trypsin reveals an insight into the interaction between a homologous inhibitor from Erythrina caffra and tissue-type plasminogen activator. Journal of Molecular Biology 275, 347-363. doi: 10.1006/jmbi.1997.1469</w:t>
       </w:r>
     </w:p>
     <w:p>
@@ -9517,7 +9632,7 @@
         <w:pStyle w:val="BodyText"/>
       </w:pPr>
       <w:r>
-        <w:t xml:space="preserve">Song HK, Suh SW (1998). Kunitz-type soybean trypsin inhibitor revisited: refined structure of its complex with porcine trypsin reveals an insight into the interaction between a homologous inhibitor from Erythrina caffra and tissue-type plasminogen activator. Journal of Molecular Biology 275, 347-363. doi: 10.1006/jmbi.1997.1469</w:t>
+        <w:t xml:space="preserve">Souza TP, Dias RO, Castelhano EC, Brandão MM, Moura DS, Silva-Filho MC (2016). Comparative analysis of expression profiling of the trypsin and chymotrypsin genes from Lepidoptera species with different levels of sensitivity to soybean peptidase inhibitors. Comparative Biochemistry and Physiology Part B: Biochemistry and Molecular Biology 196-197, 67-73. doi: 10.1016/j.cbpb.2016.02.007</w:t>
       </w:r>
     </w:p>
     <w:p>
@@ -9525,7 +9640,7 @@
         <w:pStyle w:val="BodyText"/>
       </w:pPr>
       <w:r>
-        <w:t xml:space="preserve">Souza TP, Dias RO, Castelhano EC, Brandão MM, Moura DS, Silva-Filho MC (2016). Comparative analysis of expression profiling of the trypsin and chymotrypsin genes from Lepidoptera species with different levels of sensitivity to soybean peptidase inhibitors. Comparative Biochemistry and Physiology Part B: Biochemistry and Molecular Biology 196-197, 67-73. doi: 10.1016/j.cbpb.2016.02.007</w:t>
+        <w:t xml:space="preserve">Terra WR, Ferreira C (1994). Insect digestive enzymes: properties, compartmentalization and function. Comparative Biochemistry and Physiology Part B: Comparative Biochemistry 109, 1-62. doi: 10.1016/0305-0491(94)90141-4</w:t>
       </w:r>
     </w:p>
     <w:p>
@@ -9533,7 +9648,7 @@
         <w:pStyle w:val="BodyText"/>
       </w:pPr>
       <w:r>
-        <w:t xml:space="preserve">Terra WR, Ferreira C (1994). Insect digestive enzymes: properties, compartmentalization and function. Comparative Biochemistry and Physiology Part B: Comparative Biochemistry 109, 1-62. doi: 10.1016/0305-0491(94)90141-4</w:t>
+        <w:t xml:space="preserve">The UniProt Consortium, Bateman A, Martin MJ, Orchard S, Magrane M, Adesina A, et al. (2025). UniProt: the Universal Protein Knowledgebase in 2025. Nucleic Acids Research 53, D609-D617. doi: 10.1093/nar/gkae1010</w:t>
       </w:r>
     </w:p>
     <w:p>
@@ -9541,7 +9656,7 @@
         <w:pStyle w:val="BodyText"/>
       </w:pPr>
       <w:r>
-        <w:t xml:space="preserve">The UniProt Consortium, Bateman A, Martin MJ, Orchard S, Magrane M, Adesina A, et al. (2025). UniProt: the Universal Protein Knowledgebase in 2025. Nucleic Acids Research 53, D609-D617. doi: 10.1093/nar/gkae1010</w:t>
+        <w:t xml:space="preserve">Valaitis AP (1995). Gypsy moth midgut proteinases: Purification and characterization of luminal trypsin, elastase and the brush border membrane leucine aminopeptidase. Insect Biochemistry and Molecular Biology 25, 139-149. doi: 10.1016/0965-1748(94)00033-e</w:t>
       </w:r>
     </w:p>
     <w:p>
@@ -9549,7 +9664,7 @@
         <w:pStyle w:val="BodyText"/>
       </w:pPr>
       <w:r>
-        <w:t xml:space="preserve">Valaitis AP (1995). Gypsy moth midgut proteinases: Purification and characterization of luminal trypsin, elastase and the brush border membrane leucine aminopeptidase. Insect Biochemistry and Molecular Biology 25, 139-149. doi: 10.1016/0965-1748(94)00033-e</w:t>
+        <w:t xml:space="preserve">Valaitis AP, Augustin S, Clancy KM (1999). Purification and characterization of the western spruce budworm larval midgut proteinases and comparison of gut activities of laboratory-reared and field-collected insects. Insect Biochemistry and Molecular Biology 29, 405-415. doi: 10.1016/s0965-1748(99)00017-x</w:t>
       </w:r>
     </w:p>
     <w:p>
@@ -9557,7 +9672,7 @@
         <w:pStyle w:val="BodyText"/>
       </w:pPr>
       <w:r>
-        <w:t xml:space="preserve">Valaitis AP, Augustin S, Clancy KM (1999). Purification and characterization of the western spruce budworm larval midgut proteinases and comparison of gut activities of laboratory-reared and field-collected insects. Insect Biochemistry and Molecular Biology 29, 405-415. doi: 10.1016/s0965-1748(99)00017-x</w:t>
+        <w:t xml:space="preserve">Valdés-Tresanco MS, Valdés-Tresanco ME, Valiente PA, Moreno E (2021). gmx_MMPBSA: A New Tool to Perform End-State Free Energy Calculations with GROMACS. Journal of Chemical Theory and Computation 17, 6281-6291. doi: 10.1021/acs.jctc.1c00645</w:t>
       </w:r>
     </w:p>
     <w:p>
@@ -9565,7 +9680,7 @@
         <w:pStyle w:val="BodyText"/>
       </w:pPr>
       <w:r>
-        <w:t xml:space="preserve">Valdés-Tresanco MS, Valdés-Tresanco ME, Valiente PA, Moreno E (2021). gmx_MMPBSA: A New Tool to Perform End-State Free Energy Calculations with GROMACS. Journal of Chemical Theory and Computation 17, 6281-6291. doi: 10.1021/acs.jctc.1c00645</w:t>
+        <w:t xml:space="preserve">van Kempen M, Kim SS, Tumescheit C, Mirdita M, Lee J, Gilchrist CLM, et al. (2024). Fast and accurate protein structure search with Foldseek. Nature Biotechnology 42, 243-246. doi: 10.1038/s41587-023-01773-0</w:t>
       </w:r>
     </w:p>
     <w:p>
@@ -9573,7 +9688,7 @@
         <w:pStyle w:val="BodyText"/>
       </w:pPr>
       <w:r>
-        <w:t xml:space="preserve">van Kempen M, Kim SS, Tumescheit C, Mirdita M, Lee J, Gilchrist CLM, et al. (2024). Fast and accurate protein structure search with Foldseek. Nature Biotechnology 42, 243-246. doi: 10.1038/s41587-023-01773-0</w:t>
+        <w:t xml:space="preserve">Varadi M, Bertoni D, Magana P, Paramval U, Pidruchna I, Radhakrishnan M, et al. (2024). AlphaFold Protein Structure Database in 2024: providing structure coverage for over 214 million protein sequences. Nucleic Acids Research 52, D368-D375. doi: 10.1093/nar/gkad1011</w:t>
       </w:r>
     </w:p>
     <w:p>
@@ -9581,7 +9696,7 @@
         <w:pStyle w:val="BodyText"/>
       </w:pPr>
       <w:r>
-        <w:t xml:space="preserve">Varadi M, Bertoni D, Magana P, Paramval U, Pidruchna I, Radhakrishnan M, et al. (2024). AlphaFold Protein Structure Database in 2024: providing structure coverage for over 214 million protein sequences. Nucleic Acids Research 52, D368-D375. doi: 10.1093/nar/gkad1011</w:t>
+        <w:t xml:space="preserve">Watson JL, Juergens D, Bennett NR, Trippe BL, Yim J, Eisenach HE, et al. (2023). De novo design of protein structure and function with RFdiffusion. Nature 620, 1089-1100. doi: 10.1038/s41586-023-06415-8</w:t>
       </w:r>
     </w:p>
     <w:p>
@@ -9589,7 +9704,7 @@
         <w:pStyle w:val="BodyText"/>
       </w:pPr>
       <w:r>
-        <w:t xml:space="preserve">Watson JL, Juergens D, Bennett NR, Trippe BL, Yim J, Eisenach HE, et al. (2023). De novo design of protein structure and function with RFdiffusion. Nature 620, 1089-1100. doi: 10.1038/s41586-023-06415-8</w:t>
+        <w:t xml:space="preserve">Werner MH, Wemmer DE (1992). Three-dimensional structure of soybean trypsin/chymotrypsin Bowman-Birk inhibitor in solution. Biochemistry 31, 999-1010. doi: 10.1021/bi00119a008</w:t>
       </w:r>
     </w:p>
     <w:p>
@@ -9597,7 +9712,7 @@
         <w:pStyle w:val="BodyText"/>
       </w:pPr>
       <w:r>
-        <w:t xml:space="preserve">Werner MH, Wemmer DE (1992). Three-dimensional structure of soybean trypsin/chymotrypsin Bowman-Birk inhibitor in solution. Biochemistry 31, 999-1010. doi: 10.1021/bi00119a008</w:t>
+        <w:t xml:space="preserve">Wohlwend J, Corso G, Passaro S, Getz N, Reveiz M, Leidal K, et al. (2024). Boltz-1: Democratizing biomolecular interaction modeling. bioRxiv [Preprint]. doi: 10.1101/2024.11.19.624167</w:t>
       </w:r>
     </w:p>
     <w:p>
@@ -9605,7 +9720,7 @@
         <w:pStyle w:val="BodyText"/>
       </w:pPr>
       <w:r>
-        <w:t xml:space="preserve">Wohlwend J, Corso G, Passaro S, Getz N, Reveiz M, Leidal K, et al. (2024). Boltz-1: Democratizing biomolecular interaction modeling. bioRxiv [Preprint]. doi: 10.1101/2024.11.19.624167</w:t>
+        <w:t xml:space="preserve">Xu X, Zhou F, Zheng L, Wang S, Peng X, Li D (2025). Sampling Challenges of MM/PBSA Binding Energy Calculations. The Journal of Physical Chemistry B 129, 11666-11678. doi: 10.1021/acs.jpcb.5c04908</w:t>
       </w:r>
     </w:p>
     <w:p>
@@ -9613,7 +9728,7 @@
         <w:pStyle w:val="BodyText"/>
       </w:pPr>
       <w:r>
-        <w:t xml:space="preserve">Xu X, Zhou F, Zheng L, Wang S, Peng X, Li D (2025). Sampling Challenges of MM/PBSA Binding Energy Calculations. The Journal of Physical Chemistry B 129, 11666-11678. doi: 10.1021/acs.jpcb.5c04908</w:t>
+        <w:t xml:space="preserve">Yang Y, Zhu YC, Ottea J, Husseneder C, Leonard BR, Abel C, et al. (2012). Characterization and transcriptional analyses of cDNAs encoding three trypsin- and chymotrypsin-like proteinases in Cry1Ab-susceptible and Cry1Ab-resistant strains of sugarcane borer, Diatraea saccharalis. Insect Science 20, 485-496. doi: 10.1111/j.1744-7917.2012.01514.x</w:t>
       </w:r>
     </w:p>
     <w:p>
@@ -9621,7 +9736,7 @@
         <w:pStyle w:val="BodyText"/>
       </w:pPr>
       <w:r>
-        <w:t xml:space="preserve">Yang Y, Zhu YC, Ottea J, Husseneder C, Leonard BR, Abel C, et al. (2012). Characterization and transcriptional analyses of cDNAs encoding three trypsin- and chymotrypsin-like proteinases in Cry1Ab-susceptible and Cry1Ab-resistant strains of sugarcane borer, Diatraea saccharalis. Insect Science 20, 485-496. doi: 10.1111/j.1744-7917.2012.01514.x</w:t>
+        <w:t xml:space="preserve">Zhan Q, Zheng S, Feng Q, Liu L (2010). A midgut-specific chymotrypsin cDNA (Slctlp1) from Spodoptera litura: cloning, characterization, localization and expression analysis. Archives of Insect Biochemistry and Physiology 76, 130-143. doi: 10.1002/arch.20353</w:t>
       </w:r>
     </w:p>
     <w:p>
@@ -9629,7 +9744,7 @@
         <w:pStyle w:val="BodyText"/>
       </w:pPr>
       <w:r>
-        <w:t xml:space="preserve">Zhan Q, Zheng S, Feng Q, Liu L (2010). A midgut-specific chymotrypsin cDNA (Slctlp1) from Spodoptera litura: cloning, characterization, localization and expression analysis. Archives of Insect Biochemistry and Physiology 76, 130-143. doi: 10.1002/arch.20353</w:t>
+        <w:t xml:space="preserve">Zhang Y, Skolnick J (2005). TM-align: a protein structure alignment algorithm based on the TM-score. Nucleic Acids Research 33, 2302-2309. doi: 10.1093/nar/gki524</w:t>
       </w:r>
     </w:p>
     <w:p>
@@ -9637,19 +9752,11 @@
         <w:pStyle w:val="BodyText"/>
       </w:pPr>
       <w:r>
-        <w:t xml:space="preserve">Zhang Y, Skolnick J (2005). TM-align: a protein structure alignment algorithm based on the TM-score. Nucleic Acids Research 33, 2302-2309. doi: 10.1093/nar/gki524</w:t>
-      </w:r>
-    </w:p>
-    <w:p>
-      <w:pPr>
-        <w:pStyle w:val="BodyText"/>
-      </w:pPr>
-      <w:r>
         <w:t xml:space="preserve">Zhou D, Lobo YA, Batista IFC, Marques-Porto R, Gustchina A, Oliva MLV, et al. (2013). Crystal Structures of a Plant Trypsin Inhibitor from Enterolobium contortisiliquum (EcTI) and of Its Complex with Bovine Trypsin. PLoS ONE 8, e62252. doi: 10.1371/journal.pone.0062252</w:t>
       </w:r>
     </w:p>
-    <w:bookmarkEnd w:id="77"/>
-    <w:bookmarkEnd w:id="78"/>
+    <w:bookmarkEnd w:id="80"/>
+    <w:bookmarkEnd w:id="81"/>
     <w:sectPr>
       <w:footerReference w:type="default" r:id="rId9"/>
       <w:footnotePr>

</xml_diff>

<commit_message>
plan: campanha de pH fora deste artigo (72 MDs, 4-5 dias); remove secao 3.11 de pH, vira trabalho futuro em 4.5; cronograma recalculado com tempos medidos (62-86 h) e E3 corrigido para 15-20 h
Co-Authored-By: Claude Opus 5 <noreply@anthropic.com>
Claude-Session: https://claude.ai/code/session_01MiFCW2tRnW4E9TJ8vSU7X2
</commit_message>
<xml_diff>
--- a/manuscript/Manuscrito_PT_leitura_novo.docx
+++ b/manuscript/Manuscrito_PT_leitura_novo.docx
@@ -342,7 +342,7 @@
               <w:rPr>
                 <w:sz w:val="18"/>
               </w:rPr>
-              <w:t xml:space="preserve">8,855 palavras no original em inglês (corpo sem tabelas, títulos e legendas; cada citação contada como uma palavra); tradução: 9,504</w:t>
+              <w:t xml:space="preserve">8,917 palavras no original em inglês (corpo sem tabelas, títulos e legendas; cada citação contada como uma palavra); tradução: 9,565</w:t>
             </w:r>
           </w:p>
         </w:tc>
@@ -1978,7 +1978,7 @@
               <w:rPr>
                 <w:sz w:val="18"/>
               </w:rPr>
-              <w:t xml:space="preserve">Campanha de pH · linear em pH 10 (N-terminal neutro), linear em pH 8,2 e macrociclo em pH 8,2 (72 simulações)</w:t>
+              <w:t xml:space="preserve">Campanha de pH (duas faixas)</w:t>
             </w:r>
           </w:p>
         </w:tc>
@@ -1995,7 +1995,7 @@
                 <w:bCs/>
                 <w:sz w:val="18"/>
               </w:rPr>
-              <w:t xml:space="preserve">agendada</w:t>
+              <w:t xml:space="preserve">fora deste artigo</w:t>
             </w:r>
             <w:r>
               <w:rPr>
@@ -2007,35 +2007,22 @@
               <w:rPr>
                 <w:sz w:val="18"/>
               </w:rPr>
-              <w:t xml:space="preserve">(espera o fim do pipeline)</w:t>
-            </w:r>
-          </w:p>
-        </w:tc>
-        <w:tc>
-          <w:tcPr/>
-          <w:p>
-            <w:pPr>
-              <w:pStyle w:val="Compact"/>
-              <w:spacing w:line="240" w:lineRule="auto"/>
-            </w:pPr>
-            <w:r>
-              <w:rPr>
-                <w:sz w:val="18"/>
-              </w:rPr>
-              <w:t xml:space="preserve">comparação pareada e Figura 12 (</w:t>
-            </w:r>
-            <w:r>
-              <w:rPr>
-                <w:rStyle w:val="VerbatimChar"/>
-                <w:sz w:val="18"/>
-              </w:rPr>
-              <w:t xml:space="preserve">compare_ph_conditions.py</w:t>
-            </w:r>
-            <w:r>
-              <w:rPr>
-                <w:sz w:val="18"/>
-              </w:rPr>
-              <w:t xml:space="preserve">); N-terminal neutro pela regra pH − 7,7 ≥ 2 (Grimsley 2009)</w:t>
+              <w:t xml:space="preserve">(decisão de 01/10: o custo, 72 simulações e 4–5 dias, não cabe no prazo)</w:t>
+            </w:r>
+          </w:p>
+        </w:tc>
+        <w:tc>
+          <w:tcPr/>
+          <w:p>
+            <w:pPr>
+              <w:pStyle w:val="Compact"/>
+              <w:spacing w:line="240" w:lineRule="auto"/>
+            </w:pPr>
+            <w:r>
+              <w:rPr>
+                <w:sz w:val="18"/>
+              </w:rPr>
+              <w:t xml:space="preserve">scripts prontos e versionados; fica para trabalho seguinte</w:t>
             </w:r>
           </w:p>
         </w:tc>
@@ -2097,13 +2084,29 @@
           <w:b/>
           <w:bCs/>
         </w:rPr>
-        <w:t xml:space="preserve">Estimativa:</w:t>
-      </w:r>
-      <w:r>
-        <w:t xml:space="preserve"> </w:t>
-      </w:r>
-      <w:r>
-        <w:t xml:space="preserve">faltam 36 simulações do E6 (40–55 min cada com a GPU compartilhada), cerca de 25 h; depois E7, E3, matriz 8 × 8, E8/E9 e, por fim, a campanha de pH (72 simulações, 2–3 dias).</w:t>
+        <w:t xml:space="preserve">Estimativa (medida em 16 simulações):</w:t>
+      </w:r>
+      <w:r>
+        <w:t xml:space="preserve"> </w:t>
+      </w:r>
+      <w:r>
+        <w:t xml:space="preserve">cada MD leva 75–105 min com a GPU compartilhada. Faltam 32 MDs do E6 (40–56 h), o E3 (~1.413 predições, 15–20 h), a matriz 8 × 8 com E8/E9 (~1 h) e 5 MDs de controle (6–9 h):</w:t>
+      </w:r>
+      <w:r>
+        <w:t xml:space="preserve"> </w:t>
+      </w:r>
+      <w:r>
+        <w:rPr>
+          <w:b/>
+          <w:bCs/>
+        </w:rPr>
+        <w:t xml:space="preserve">2,7 a 3,5 dias de processamento</w:t>
+      </w:r>
+      <w:r>
+        <w:t xml:space="preserve"> </w:t>
+      </w:r>
+      <w:r>
+        <w:t xml:space="preserve">até dar para fechar o artigo.</w:t>
       </w:r>
     </w:p>
     <w:p>
@@ -2229,7 +2232,7 @@
     </w:p>
     <w:bookmarkEnd w:id="12"/>
     <w:bookmarkEnd w:id="13"/>
-    <w:bookmarkStart w:id="96" w:name="Xaea1da447ef5fee1fbbe056814497d6ce16bf65"/>
+    <w:bookmarkStart w:id="95" w:name="Xaea1da447ef5fee1fbbe056814497d6ce16bf65"/>
     <w:p>
       <w:pPr>
         <w:pStyle w:val="Heading1"/>
@@ -4036,61 +4039,7 @@
         <w:t xml:space="preserve">−</w:t>
       </w:r>
       <w:r>
-        <w:t xml:space="preserve">, o padrão do CHARMM36; em pH 10 o grupo α-amino (pKa ≈ 8) seria majoritariamente neutro, de modo que isso é uma limitação que afeta apenas a frente linear.</w:t>
-      </w:r>
-      <w:r>
-        <w:t xml:space="preserve"> </w:t>
-      </w:r>
-      <w:r>
-        <w:rPr>
-          <w:rStyle w:val="Pendente"/>
-        </w:rPr>
-        <w:t xml:space="preserve">PENDENTE: depois das 48 simulações, a frente linear será repetida em pH 10 com N-terminal neutro (NH</w:t>
-      </w:r>
-      <w:r>
-        <w:rPr>
-          <w:rStyle w:val="Pendente"/>
-          <w:vertAlign w:val="subscript"/>
-        </w:rPr>
-        <w:t xml:space="preserve">2</w:t>
-      </w:r>
-      <w:r>
-        <w:rPr>
-          <w:rStyle w:val="Pendente"/>
-        </w:rPr>
-        <w:t xml:space="preserve">; pKa 7,7 ± 0,5 em proteínas dobradas, Grimsley et al., 2009) e as duas frentes em pH 8,2 (o pH das outras simulações tripsina–peptídeo do nosso grupo), com a protonação das cadeias laterais recalculada em cada pH; as simulações concluídas (pH 10, NH</w:t>
-      </w:r>
-      <w:r>
-        <w:rPr>
-          <w:rStyle w:val="Pendente"/>
-          <w:vertAlign w:val="subscript"/>
-        </w:rPr>
-        <w:t xml:space="preserve">3</w:t>
-      </w:r>
-      <w:r>
-        <w:rPr>
-          <w:rStyle w:val="Pendente"/>
-          <w:vertAlign w:val="superscript"/>
-        </w:rPr>
-        <w:t xml:space="preserve">+</w:t>
-      </w:r>
-      <w:r>
-        <w:rPr>
-          <w:rStyle w:val="Pendente"/>
-        </w:rPr>
-        <w:t xml:space="preserve"> </w:t>
-      </w:r>
-      <w:r>
-        <w:rPr>
-          <w:rStyle w:val="Pendente"/>
-        </w:rPr>
-        <w:t xml:space="preserve">na frente linear) são o braço de referência. Acrescentar a frase de método, a comparação (Figura 12) e o texto das Seções 3.9/3.10 ao concluir.</w:t>
-      </w:r>
-      <w:r>
-        <w:t xml:space="preserve"> </w:t>
-      </w:r>
-      <w:r>
-        <w:t xml:space="preserve">O macrociclo não tem extremidades: o GROMACS 2024 e posteriores (pdb2gmx) forma a ligação cabeça–cauda quando a distância C(n)–N(1) da predição do Boltz-2 é de ligação, e gera os termos de ângulo, diedro, par 1–4, impróprio e CMAP do anel com os mesmos parâmetros do CHARMM36 das ligações peptídicas internas. O script de montagem confere que a ligação C(n)–N(1) e o termo CMAP de cada resíduo estão presentes e para caso contrário, de modo que um anel nunca roda como cadeia linear aberta.</w:t>
+        <w:t xml:space="preserve">, o padrão do CHARMM36; em pH 10 o grupo α-amino (pKa ≈ 8) seria majoritariamente neutro, de modo que isso é uma limitação que afeta apenas a frente linear. Assim, todas as simulações deste trabalho compartilham um só estado de protonação, o que as mantém comparáveis; o efeito da carga do N-terminal e de um pH menos alcalino fica para trabalho separado (Seção 4.5). O macrociclo não tem extremidades: o GROMACS 2024 e posteriores (pdb2gmx) forma a ligação cabeça–cauda quando a distância C(n)–N(1) da predição do Boltz-2 é de ligação, e gera os termos de ângulo, diedro, par 1–4, impróprio e CMAP do anel com os mesmos parâmetros do CHARMM36 das ligações peptídicas internas. O script de montagem confere que a ligação C(n)–N(1) e o termo CMAP de cada resíduo estão presentes e para caso contrário, de modo que um anel nunca roda como cadeia linear aberta.</w:t>
       </w:r>
       <w:r>
         <w:t xml:space="preserve"> </w:t>
@@ -4195,7 +4144,7 @@
     </w:p>
     <w:bookmarkEnd w:id="31"/>
     <w:bookmarkEnd w:id="32"/>
-    <w:bookmarkStart w:id="75" w:name="resultados"/>
+    <w:bookmarkStart w:id="74" w:name="resultados"/>
     <w:p>
       <w:pPr>
         <w:pStyle w:val="Heading2"/>
@@ -9929,78 +9878,13 @@
       </w:r>
     </w:p>
     <w:bookmarkEnd w:id="69"/>
-    <w:bookmarkStart w:id="70" w:name="efeito-do-ph-e-da-carga-do-n-terminal"/>
+    <w:bookmarkStart w:id="73" w:name="peptídeos-candidatos-finais"/>
     <w:p>
       <w:pPr>
         <w:pStyle w:val="Heading3"/>
       </w:pPr>
       <w:r>
-        <w:t xml:space="preserve">3.11 Efeito do pH e da carga do N-terminal</w:t>
-      </w:r>
-    </w:p>
-    <w:p>
-      <w:pPr>
-        <w:pStyle w:val="FirstParagraph"/>
-      </w:pPr>
-      <w:r>
-        <w:rPr>
-          <w:rStyle w:val="Pendente"/>
-        </w:rPr>
-        <w:t xml:space="preserve">PENDENTE: comparação pareada das simulações de triagem em pH 10,0 (linear com NH</w:t>
-      </w:r>
-      <w:r>
-        <w:rPr>
-          <w:rStyle w:val="Pendente"/>
-          <w:vertAlign w:val="subscript"/>
-        </w:rPr>
-        <w:t xml:space="preserve">3</w:t>
-      </w:r>
-      <w:r>
-        <w:rPr>
-          <w:rStyle w:val="Pendente"/>
-          <w:vertAlign w:val="superscript"/>
-        </w:rPr>
-        <w:t xml:space="preserve">+</w:t>
-      </w:r>
-      <w:r>
-        <w:rPr>
-          <w:rStyle w:val="Pendente"/>
-        </w:rPr>
-        <w:t xml:space="preserve"> </w:t>
-      </w:r>
-      <w:r>
-        <w:rPr>
-          <w:rStyle w:val="Pendente"/>
-        </w:rPr>
-        <w:t xml:space="preserve">e com N-terminal neutro; macrociclo) e em pH 8,2 (linear e macrociclo), com o número de candidatos que passam na triagem, a mudança da ocupância de S1 por candidato e o custo computacional por condição (Figura 12;</w:t>
-      </w:r>
-      <w:r>
-        <w:rPr>
-          <w:rStyle w:val="Pendente"/>
-        </w:rPr>
-        <w:t xml:space="preserve"> </w:t>
-      </w:r>
-      <w:r>
-        <w:rPr>
-          <w:rStyle w:val="VerbatimChar"/>
-        </w:rPr>
-        <w:t xml:space="preserve">compare_ph_conditions.py</w:t>
-      </w:r>
-      <w:r>
-        <w:rPr>
-          <w:rStyle w:val="Pendente"/>
-        </w:rPr>
-        <w:t xml:space="preserve">). Uma réplica de 10 ns por candidato: relatar tendências entre candidatos, não diferenças por candidato.</w:t>
-      </w:r>
-    </w:p>
-    <w:bookmarkEnd w:id="70"/>
-    <w:bookmarkStart w:id="74" w:name="peptídeos-candidatos-finais"/>
-    <w:p>
-      <w:pPr>
-        <w:pStyle w:val="Heading3"/>
-      </w:pPr>
-      <w:r>
-        <w:t xml:space="preserve">3.12 Peptídeos candidatos finais</w:t>
+        <w:t xml:space="preserve">3.11 Peptídeos candidatos finais</w:t>
       </w:r>
     </w:p>
     <w:p>
@@ -10064,18 +9948,18 @@
           <wp:inline>
             <wp:extent cx="5334000" cy="3897923"/>
             <wp:effectExtent b="0" l="0" r="0" t="0"/>
-            <wp:docPr descr="Figura 13. Matriz de evidências dos 48 candidatos finais (esquerda, linear; direita, macrociclo), ordenados por camada (A, B, C, P) e, dentro da camada, pela ocupância de S1. Colunas: confiança do Boltz-2 (E2), diferença pareada contra controles embaralhados (E3), controle de qualidade de pose (E4), ocupância de S1 a 5 Å na segunda metade da simulação de 10 ns, âncora idêntica nas duas metades, critério estrito do anel (com a fração de quadros com |ω| ≥ 150° quando falha) e robustez ao pH. Células vazias: ainda não disponíveis (provisório, 12 de 48 simulações; E3 e campanha de pH pendentes)." title="" id="72" name="Picture"/>
+            <wp:docPr descr="Figura 13. Matriz de evidências dos 48 candidatos finais (esquerda, linear; direita, macrociclo), ordenados por camada (A, B, C, P) e, dentro da camada, pela ocupância de S1. Colunas: confiança do Boltz-2 (E2), diferença pareada contra controles embaralhados (E3), controle de qualidade de pose (E4), ocupância de S1 a 5 Å na segunda metade da simulação de 10 ns, âncora idêntica nas duas metades, critério estrito do anel (com a fração de quadros com |ω| ≥ 150° quando falha) e robustez ao pH. Células vazias: ainda não disponíveis (provisório, 12 de 48 simulações; E3 e campanha de pH pendentes)." title="" id="71" name="Picture"/>
             <a:graphic>
               <a:graphicData uri="http://schemas.openxmlformats.org/drawingml/2006/picture">
                 <pic:pic>
                   <pic:nvPicPr>
-                    <pic:cNvPr descr="figures/pt/fig13_candidatos_finais.png" id="73" name="Picture"/>
+                    <pic:cNvPr descr="figures/pt/fig13_candidatos_finais.png" id="72" name="Picture"/>
                     <pic:cNvPicPr>
                       <a:picLocks noChangeArrowheads="1" noChangeAspect="1"/>
                     </pic:cNvPicPr>
                   </pic:nvPicPr>
                   <pic:blipFill>
-                    <a:blip r:embed="rId71"/>
+                    <a:blip r:embed="rId70"/>
                     <a:stretch>
                       <a:fillRect/>
                     </a:stretch>
@@ -10127,9 +10011,9 @@
         </w:pict>
       </w:r>
     </w:p>
+    <w:bookmarkEnd w:id="73"/>
     <w:bookmarkEnd w:id="74"/>
-    <w:bookmarkEnd w:id="75"/>
-    <w:bookmarkStart w:id="81" w:name="discussão"/>
+    <w:bookmarkStart w:id="80" w:name="discussão"/>
     <w:p>
       <w:pPr>
         <w:pStyle w:val="Heading2"/>
@@ -10138,7 +10022,7 @@
         <w:t xml:space="preserve">4 Discussão</w:t>
       </w:r>
     </w:p>
-    <w:bookmarkStart w:id="76" w:name="principais-achados"/>
+    <w:bookmarkStart w:id="75" w:name="principais-achados"/>
     <w:p>
       <w:pPr>
         <w:pStyle w:val="Heading3"/>
@@ -10204,50 +10088,50 @@
         <w:t xml:space="preserve">menos do que o inibidor de Kunitz da soja, o que seus autores atribuíram à menor flexibilidade e a um aumento evolutivo da hidrofobicidade dos subsítios (Patarroyo-Vargas et al., 2020).</w:t>
       </w:r>
     </w:p>
+    <w:bookmarkEnd w:id="75"/>
+    <w:bookmarkStart w:id="76" w:name="Xe3615bf2ba7667c30e4492e0c2fa08d640e849c"/>
+    <w:p>
+      <w:pPr>
+        <w:pStyle w:val="Heading3"/>
+      </w:pPr>
+      <w:r>
+        <w:t xml:space="preserve">4.2 O que a calibração sustenta e o que não sustenta</w:t>
+      </w:r>
+    </w:p>
+    <w:p>
+      <w:pPr>
+        <w:pStyle w:val="FirstParagraph"/>
+      </w:pPr>
+      <w:r>
+        <w:t xml:space="preserve">O Boltz-2 preferiu o inibidor real à sua isca embaralhada em todos os pares, mas os escores absolutos de inibidores reais e de iscas se sobrepuseram, e uma isca embaralhada de SFTI-1 com 14 resíduos teve 0,944. Os candidatos da campanha têm 5–8 resíduos e, em sua maioria, escores entre 0,80 e 0,95; a calibração sustenta, portanto, a comparação de um candidato com um controle pareado, e não sustenta a leitura de uma confiança de 0,9 como evidência de ligação. Duas propriedades da calibração limitam ainda mais seu alcance. Primeiro, as iscas são sequências embaralhadas de proteínas enoveladas, de modo que diferem dos inibidores reais no enovelamento e não só na ligação; uma confiança baixa para uma isca pode refletir a ausência de um enovelamento e não a ausência de uma superfície complementar. Segundo, os ligantes da calibração têm 14–176 resíduos, ao passo que os candidatos têm 5–8, e não foi feita calibração com peptídeos curtos de atividade conhecida. Os pares também não são independentes, pois cada isca é usada com dois receptores.</w:t>
+      </w:r>
+    </w:p>
+    <w:p>
+      <w:pPr>
+        <w:pStyle w:val="BodyText"/>
+      </w:pPr>
+      <w:r>
+        <w:t xml:space="preserve">O RMSD do ligante após superposição no receptor separou 9 de 10 pares, com direção esperada fixada de antemão. Essa métrica premia um ligante que permanece onde o modelo de co-dobramento o colocou, e uma isca predita com confiança menor pode se afastar apenas por isso; o resultado deve ser lido como concordância entre a estabilidade da pose em uma simulação de 2 ns e a confiança do modelo de co-dobramento, e não como medida independente de afinidade. O MM-GBSA de uma única trajetória de 2 ns, sem termo de entropia, colocou o inibidor real em primeiro lugar em apenas 4 de 10 pares e se correlacionou com o número de resíduos do receptor em contato com o ligante (ρ = −0,93). Isso é coerente com a sensibilidade geral dos métodos de ponto final à amostragem e ao tipo de sistema (Hou et al., 2011; Genheden e Ryde, 2015; Xu et al., 2025) e significa que o MM-GBSA nessa configuração informa o tamanho da interface. Por isso, ele não foi usado para ordenar candidatos.</w:t>
+      </w:r>
+    </w:p>
+    <w:p>
+      <w:pPr>
+        <w:pStyle w:val="BodyText"/>
+      </w:pPr>
+      <w:r>
+        <w:t xml:space="preserve">Um ponto metodológico merece ênfase. Moléculas separadas de receptor e de ligante podem ser gravadas em imagens periódicas diferentes da caixa de simulação; em um de nossos sistemas, a distância entre os centros de massa do receptor e do peptídeo chegou a 94,8 Å em uma caixa de 116 Å enquanto as duas moléculas estavam em contato em todos os quadros. Qualquer análise de RMSD ou de contatos de simulações proteína–peptídeo que não corrija isso relatará o deslocamento da imagem da caixa como instabilidade, e a correção deve ser verificada explicitamente quando uma triagem depende dessas métricas.</w:t>
+      </w:r>
+    </w:p>
+    <w:p>
+      <w:pPr>
+        <w:pStyle w:val="BodyText"/>
+      </w:pPr>
+      <w:r>
+        <w:t xml:space="preserve">A correlação de postos de 0,57 entre rodadas (Seção 3.8) acrescenta outro limite. Uma única predição do Boltz-2 para um peptídeo curto é um ordenador ruidoso mesmo com entrada idêntica, de modo que diferenças de poucos centésimos na confiança, que separam muitos candidatos, não devem ser interpretadas, e a concordância entre as formas linear e cíclica (ρ = 0,50) não pode ser lida como efeito de modalidade enquanto não for comparada a esse teto.</w:t>
+      </w:r>
+    </w:p>
     <w:bookmarkEnd w:id="76"/>
-    <w:bookmarkStart w:id="77" w:name="Xe3615bf2ba7667c30e4492e0c2fa08d640e849c"/>
-    <w:p>
-      <w:pPr>
-        <w:pStyle w:val="Heading3"/>
-      </w:pPr>
-      <w:r>
-        <w:t xml:space="preserve">4.2 O que a calibração sustenta e o que não sustenta</w:t>
-      </w:r>
-    </w:p>
-    <w:p>
-      <w:pPr>
-        <w:pStyle w:val="FirstParagraph"/>
-      </w:pPr>
-      <w:r>
-        <w:t xml:space="preserve">O Boltz-2 preferiu o inibidor real à sua isca embaralhada em todos os pares, mas os escores absolutos de inibidores reais e de iscas se sobrepuseram, e uma isca embaralhada de SFTI-1 com 14 resíduos teve 0,944. Os candidatos da campanha têm 5–8 resíduos e, em sua maioria, escores entre 0,80 e 0,95; a calibração sustenta, portanto, a comparação de um candidato com um controle pareado, e não sustenta a leitura de uma confiança de 0,9 como evidência de ligação. Duas propriedades da calibração limitam ainda mais seu alcance. Primeiro, as iscas são sequências embaralhadas de proteínas enoveladas, de modo que diferem dos inibidores reais no enovelamento e não só na ligação; uma confiança baixa para uma isca pode refletir a ausência de um enovelamento e não a ausência de uma superfície complementar. Segundo, os ligantes da calibração têm 14–176 resíduos, ao passo que os candidatos têm 5–8, e não foi feita calibração com peptídeos curtos de atividade conhecida. Os pares também não são independentes, pois cada isca é usada com dois receptores.</w:t>
-      </w:r>
-    </w:p>
-    <w:p>
-      <w:pPr>
-        <w:pStyle w:val="BodyText"/>
-      </w:pPr>
-      <w:r>
-        <w:t xml:space="preserve">O RMSD do ligante após superposição no receptor separou 9 de 10 pares, com direção esperada fixada de antemão. Essa métrica premia um ligante que permanece onde o modelo de co-dobramento o colocou, e uma isca predita com confiança menor pode se afastar apenas por isso; o resultado deve ser lido como concordância entre a estabilidade da pose em uma simulação de 2 ns e a confiança do modelo de co-dobramento, e não como medida independente de afinidade. O MM-GBSA de uma única trajetória de 2 ns, sem termo de entropia, colocou o inibidor real em primeiro lugar em apenas 4 de 10 pares e se correlacionou com o número de resíduos do receptor em contato com o ligante (ρ = −0,93). Isso é coerente com a sensibilidade geral dos métodos de ponto final à amostragem e ao tipo de sistema (Hou et al., 2011; Genheden e Ryde, 2015; Xu et al., 2025) e significa que o MM-GBSA nessa configuração informa o tamanho da interface. Por isso, ele não foi usado para ordenar candidatos.</w:t>
-      </w:r>
-    </w:p>
-    <w:p>
-      <w:pPr>
-        <w:pStyle w:val="BodyText"/>
-      </w:pPr>
-      <w:r>
-        <w:t xml:space="preserve">Um ponto metodológico merece ênfase. Moléculas separadas de receptor e de ligante podem ser gravadas em imagens periódicas diferentes da caixa de simulação; em um de nossos sistemas, a distância entre os centros de massa do receptor e do peptídeo chegou a 94,8 Å em uma caixa de 116 Å enquanto as duas moléculas estavam em contato em todos os quadros. Qualquer análise de RMSD ou de contatos de simulações proteína–peptídeo que não corrija isso relatará o deslocamento da imagem da caixa como instabilidade, e a correção deve ser verificada explicitamente quando uma triagem depende dessas métricas.</w:t>
-      </w:r>
-    </w:p>
-    <w:p>
-      <w:pPr>
-        <w:pStyle w:val="BodyText"/>
-      </w:pPr>
-      <w:r>
-        <w:t xml:space="preserve">A correlação de postos de 0,57 entre rodadas (Seção 3.8) acrescenta outro limite. Uma única predição do Boltz-2 para um peptídeo curto é um ordenador ruidoso mesmo com entrada idêntica, de modo que diferenças de poucos centésimos na confiança, que separam muitos candidatos, não devem ser interpretadas, e a concordância entre as formas linear e cíclica (ρ = 0,50) não pode ser lida como efeito de modalidade enquanto não for comparada a esse teto.</w:t>
-      </w:r>
-    </w:p>
-    <w:bookmarkEnd w:id="77"/>
-    <w:bookmarkStart w:id="78" w:name="Xafece074cecce80077a0c9860132a7cfb8c9c03"/>
+    <w:bookmarkStart w:id="77" w:name="Xafece074cecce80077a0c9860132a7cfb8c9c03"/>
     <w:p>
       <w:pPr>
         <w:pStyle w:val="Heading3"/>
@@ -10325,8 +10209,8 @@
         <w:t xml:space="preserve">As regras de motivos também são grosseiras. O escore é uma contagem ponderada de sítios, a regra do tipo elastase sinaliza quatro resíduos comuns (alanina, glicina, serina e valina), a regra do tipo pepsina não é relevante para o intestino de lepidópteros, e uma classe pode mudar com um único sítio (GIFDDIG não tem sítio de tripsina e, ainda assim, é rotulada MARGINAL). O rótulo RESISTENTE é uma previsão computacional de baixa carga de motivos, e não uma medida de estabilidade no intestino médio.</w:t>
       </w:r>
     </w:p>
-    <w:bookmarkEnd w:id="78"/>
-    <w:bookmarkStart w:id="79" w:name="limitações"/>
+    <w:bookmarkEnd w:id="77"/>
+    <w:bookmarkStart w:id="78" w:name="limitações"/>
     <w:p>
       <w:pPr>
         <w:pStyle w:val="Heading3"/>
@@ -10411,8 +10295,8 @@
         <w:t xml:space="preserve">com flutuação quadrática média de 0,2% e deriva desprezível, de modo que nenhum dos dois produziu artefato detectável.</w:t>
       </w:r>
     </w:p>
-    <w:bookmarkEnd w:id="79"/>
-    <w:bookmarkStart w:id="80" w:name="perspectivas"/>
+    <w:bookmarkEnd w:id="78"/>
+    <w:bookmarkStart w:id="79" w:name="perspectivas"/>
     <w:p>
       <w:pPr>
         <w:pStyle w:val="Heading3"/>
@@ -10426,7 +10310,7 @@
         <w:pStyle w:val="FirstParagraph"/>
       </w:pPr>
       <w:r>
-        <w:t xml:space="preserve">As melhorias mais diretas decorrem das limitações: fixar a sequência do receptor durante o desenho e permitir exatamente um resíduo P1 básico seguido de prolina já no desenho, em vez de filtrar depois; desenhar esqueletos lineares diretamente; proteger ou neutralizar as extremidades dos peptídeos lineares; simulações replicadas dos candidatos que passarem, estendidas a centenas de nanossegundos com um campo de força moderno; e um painel de contrasseleção de proteases não-alvo para que a seletividade se torne um objetivo explícito. O teste decisivo é enzimático: ensaios de inibição com extratos do intestino médio de</w:t>
+        <w:t xml:space="preserve">As melhorias mais diretas decorrem das limitações: fixar a sequência do receptor durante o desenho e permitir exatamente um resíduo P1 básico seguido de prolina já no desenho, em vez de filtrar depois; desenhar esqueletos lineares diretamente; proteger ou neutralizar as extremidades dos peptídeos lineares e testar quanto o estado de protonação e o pH do meio alteram o resultado, que aqui ficam fixos e cuja comparação deixamos para trabalho separado; simulações replicadas dos candidatos que passarem, estendidas a centenas de nanossegundos com um campo de força moderno; e um painel de contrasseleção de proteases não-alvo para que a seletividade se torne um objetivo explícito. O teste decisivo é enzimático: ensaios de inibição com extratos do intestino médio de</w:t>
       </w:r>
       <w:r>
         <w:t xml:space="preserve"> </w:t>
@@ -10445,15 +10329,42 @@
         <w:t xml:space="preserve">e com tripsinas não-alvo, e um ensaio de estabilidade dos candidatos nos mesmos extratos.</w:t>
       </w:r>
     </w:p>
+    <w:bookmarkEnd w:id="79"/>
     <w:bookmarkEnd w:id="80"/>
+    <w:bookmarkStart w:id="81" w:name="declaração-de-disponibilidade-de-dados"/>
+    <w:p>
+      <w:pPr>
+        <w:pStyle w:val="Heading2"/>
+      </w:pPr>
+      <w:r>
+        <w:t xml:space="preserve">Declaração de disponibilidade de dados</w:t>
+      </w:r>
+    </w:p>
+    <w:p>
+      <w:pPr>
+        <w:pStyle w:val="FirstParagraph"/>
+      </w:pPr>
+      <w:r>
+        <w:t xml:space="preserve">O código, os arquivos de configuração, as listas de candidatos e os escores por candidato estão no repositório do projeto (https://github.com/eulaliobqi/design-inibidores).</w:t>
+      </w:r>
+      <w:r>
+        <w:t xml:space="preserve"> </w:t>
+      </w:r>
+      <w:r>
+        <w:rPr>
+          <w:rStyle w:val="Pendente"/>
+        </w:rPr>
+        <w:t xml:space="preserve">PENDENTE: confirmar visibilidade do repositório e DOI de arquivamento (por exemplo Zenodo) antes da submissão.</w:t>
+      </w:r>
+    </w:p>
     <w:bookmarkEnd w:id="81"/>
-    <w:bookmarkStart w:id="82" w:name="declaração-de-disponibilidade-de-dados"/>
+    <w:bookmarkStart w:id="82" w:name="declaração-de-ética"/>
     <w:p>
       <w:pPr>
         <w:pStyle w:val="Heading2"/>
       </w:pPr>
       <w:r>
-        <w:t xml:space="preserve">Declaração de disponibilidade de dados</w:t>
+        <w:t xml:space="preserve">Declaração de ética</w:t>
       </w:r>
     </w:p>
     <w:p>
@@ -10461,26 +10372,38 @@
         <w:pStyle w:val="FirstParagraph"/>
       </w:pPr>
       <w:r>
-        <w:t xml:space="preserve">O código, os arquivos de configuração, as listas de candidatos e os escores por candidato estão no repositório do projeto (https://github.com/eulaliobqi/design-inibidores).</w:t>
-      </w:r>
-      <w:r>
-        <w:t xml:space="preserve"> </w:t>
-      </w:r>
+        <w:t xml:space="preserve">Não se aplica. É um estudo computacional; não envolveu animais, participantes humanos nem dados pessoais.</w:t>
+      </w:r>
+    </w:p>
+    <w:bookmarkEnd w:id="82"/>
+    <w:bookmarkStart w:id="83" w:name="contribuições-dos-autores"/>
+    <w:p>
+      <w:pPr>
+        <w:pStyle w:val="Heading2"/>
+      </w:pPr>
+      <w:r>
+        <w:t xml:space="preserve">Contribuições dos autores</w:t>
+      </w:r>
+    </w:p>
+    <w:p>
+      <w:pPr>
+        <w:pStyle w:val="FirstParagraph"/>
+      </w:pPr>
       <w:r>
         <w:rPr>
           <w:rStyle w:val="Pendente"/>
         </w:rPr>
-        <w:t xml:space="preserve">PENDENTE: confirmar visibilidade do repositório e DOI de arquivamento (por exemplo Zenodo) antes da submissão.</w:t>
-      </w:r>
-    </w:p>
-    <w:bookmarkEnd w:id="82"/>
-    <w:bookmarkStart w:id="83" w:name="declaração-de-ética"/>
+        <w:t xml:space="preserve">PENDENTE: a completar pelos autores (papéis CRediT).</w:t>
+      </w:r>
+    </w:p>
+    <w:bookmarkEnd w:id="83"/>
+    <w:bookmarkStart w:id="84" w:name="financiamento"/>
     <w:p>
       <w:pPr>
         <w:pStyle w:val="Heading2"/>
       </w:pPr>
       <w:r>
-        <w:t xml:space="preserve">Declaração de ética</w:t>
+        <w:t xml:space="preserve">Financiamento</w:t>
       </w:r>
     </w:p>
     <w:p>
@@ -10488,17 +10411,20 @@
         <w:pStyle w:val="FirstParagraph"/>
       </w:pPr>
       <w:r>
-        <w:t xml:space="preserve">Não se aplica. É um estudo computacional; não envolveu animais, participantes humanos nem dados pessoais.</w:t>
-      </w:r>
-    </w:p>
-    <w:bookmarkEnd w:id="83"/>
-    <w:bookmarkStart w:id="84" w:name="contribuições-dos-autores"/>
+        <w:rPr>
+          <w:rStyle w:val="Pendente"/>
+        </w:rPr>
+        <w:t xml:space="preserve">PENDENTE: a completar pelos autores.</w:t>
+      </w:r>
+    </w:p>
+    <w:bookmarkEnd w:id="84"/>
+    <w:bookmarkStart w:id="85" w:name="agradecimentos"/>
     <w:p>
       <w:pPr>
         <w:pStyle w:val="Heading2"/>
       </w:pPr>
       <w:r>
-        <w:t xml:space="preserve">Contribuições dos autores</w:t>
+        <w:t xml:space="preserve">Agradecimentos</w:t>
       </w:r>
     </w:p>
     <w:p>
@@ -10509,17 +10435,44 @@
         <w:rPr>
           <w:rStyle w:val="Pendente"/>
         </w:rPr>
-        <w:t xml:space="preserve">PENDENTE: a completar pelos autores (papéis CRediT).</w:t>
-      </w:r>
-    </w:p>
-    <w:bookmarkEnd w:id="84"/>
-    <w:bookmarkStart w:id="85" w:name="financiamento"/>
+        <w:t xml:space="preserve">PENDENTE: a completar pelos autores.</w:t>
+      </w:r>
+      <w:r>
+        <w:t xml:space="preserve"> </w:t>
+      </w:r>
+      <w:r>
+        <w:t xml:space="preserve">Declaração de IA generativa (a revista exige que o uso seja reconhecido):</w:t>
+      </w:r>
+      <w:r>
+        <w:t xml:space="preserve"> </w:t>
+      </w:r>
+      <w:r>
+        <w:rPr>
+          <w:rStyle w:val="Pendente"/>
+        </w:rPr>
+        <w:t xml:space="preserve">PENDENTE, autores a confirmar o texto:</w:t>
+      </w:r>
+      <w:r>
+        <w:rPr>
+          <w:rStyle w:val="Pendente"/>
+        </w:rPr>
+        <w:t xml:space="preserve"> </w:t>
+      </w:r>
+      <w:r>
+        <w:rPr>
+          <w:rStyle w:val="Pendente"/>
+        </w:rPr>
+        <w:t xml:space="preserve">“Usou-se IA generativa (Claude, Anthropic) como assistente para escrever scripts de análise, gerar figuras e redigir e traduzir texto. Os autores conferiram todos os resultados numéricos nos arquivos de saída, conferiram cada referência no Crossref ou PubMed e assumem total responsabilidade pelo conteúdo.”</w:t>
+      </w:r>
+    </w:p>
+    <w:bookmarkEnd w:id="85"/>
+    <w:bookmarkStart w:id="86" w:name="conflito-de-interesses"/>
     <w:p>
       <w:pPr>
         <w:pStyle w:val="Heading2"/>
       </w:pPr>
       <w:r>
-        <w:t xml:space="preserve">Financiamento</w:t>
+        <w:t xml:space="preserve">Conflito de interesses</w:t>
       </w:r>
     </w:p>
     <w:p>
@@ -10533,77 +10486,8 @@
         <w:t xml:space="preserve">PENDENTE: a completar pelos autores.</w:t>
       </w:r>
     </w:p>
-    <w:bookmarkEnd w:id="85"/>
-    <w:bookmarkStart w:id="86" w:name="agradecimentos"/>
-    <w:p>
-      <w:pPr>
-        <w:pStyle w:val="Heading2"/>
-      </w:pPr>
-      <w:r>
-        <w:t xml:space="preserve">Agradecimentos</w:t>
-      </w:r>
-    </w:p>
-    <w:p>
-      <w:pPr>
-        <w:pStyle w:val="FirstParagraph"/>
-      </w:pPr>
-      <w:r>
-        <w:rPr>
-          <w:rStyle w:val="Pendente"/>
-        </w:rPr>
-        <w:t xml:space="preserve">PENDENTE: a completar pelos autores.</w:t>
-      </w:r>
-      <w:r>
-        <w:t xml:space="preserve"> </w:t>
-      </w:r>
-      <w:r>
-        <w:t xml:space="preserve">Declaração de IA generativa (a revista exige que o uso seja reconhecido):</w:t>
-      </w:r>
-      <w:r>
-        <w:t xml:space="preserve"> </w:t>
-      </w:r>
-      <w:r>
-        <w:rPr>
-          <w:rStyle w:val="Pendente"/>
-        </w:rPr>
-        <w:t xml:space="preserve">PENDENTE, autores a confirmar o texto:</w:t>
-      </w:r>
-      <w:r>
-        <w:rPr>
-          <w:rStyle w:val="Pendente"/>
-        </w:rPr>
-        <w:t xml:space="preserve"> </w:t>
-      </w:r>
-      <w:r>
-        <w:rPr>
-          <w:rStyle w:val="Pendente"/>
-        </w:rPr>
-        <w:t xml:space="preserve">“Usou-se IA generativa (Claude, Anthropic) como assistente para escrever scripts de análise, gerar figuras e redigir e traduzir texto. Os autores conferiram todos os resultados numéricos nos arquivos de saída, conferiram cada referência no Crossref ou PubMed e assumem total responsabilidade pelo conteúdo.”</w:t>
-      </w:r>
-    </w:p>
     <w:bookmarkEnd w:id="86"/>
-    <w:bookmarkStart w:id="87" w:name="conflito-de-interesses"/>
-    <w:p>
-      <w:pPr>
-        <w:pStyle w:val="Heading2"/>
-      </w:pPr>
-      <w:r>
-        <w:t xml:space="preserve">Conflito de interesses</w:t>
-      </w:r>
-    </w:p>
-    <w:p>
-      <w:pPr>
-        <w:pStyle w:val="FirstParagraph"/>
-      </w:pPr>
-      <w:r>
-        <w:rPr>
-          <w:rStyle w:val="Pendente"/>
-        </w:rPr>
-        <w:t xml:space="preserve">PENDENTE: a completar pelos autores.</w:t>
-      </w:r>
-    </w:p>
-    <w:bookmarkEnd w:id="87"/>
-    <w:bookmarkStart w:id="94" w:name="figuras-suplementares"/>
+    <w:bookmarkStart w:id="93" w:name="figuras-suplementares"/>
     <w:p>
       <w:pPr>
         <w:pStyle w:val="Heading2"/>
@@ -10621,18 +10505,18 @@
           <wp:inline>
             <wp:extent cx="4679999" cy="2092235"/>
             <wp:effectExtent b="0" l="0" r="0" t="0"/>
-            <wp:docPr descr="Figura S1. Triagem por escore de motivos por espécie sob a regra linear-estrita e a circular (porcentagem das sequências de cada espécie por classe)." title="" id="89" name="Picture"/>
+            <wp:docPr descr="Figura S1. Triagem por escore de motivos por espécie sob a regra linear-estrita e a circular (porcentagem das sequências de cada espécie por classe)." title="" id="88" name="Picture"/>
             <a:graphic>
               <a:graphicData uri="http://schemas.openxmlformats.org/drawingml/2006/picture">
                 <pic:pic>
                   <pic:nvPicPr>
-                    <pic:cNvPr descr="figures/pt/figS1_regras_motivo.png" id="90" name="Picture"/>
+                    <pic:cNvPr descr="figures/pt/figS1_regras_motivo.png" id="89" name="Picture"/>
                     <pic:cNvPicPr>
                       <a:picLocks noChangeArrowheads="1" noChangeAspect="1"/>
                     </pic:cNvPicPr>
                   </pic:nvPicPr>
                   <pic:blipFill>
-                    <a:blip r:embed="rId88"/>
+                    <a:blip r:embed="rId87"/>
                     <a:stretch>
                       <a:fillRect/>
                     </a:stretch>
@@ -10686,18 +10570,18 @@
           <wp:inline>
             <wp:extent cx="3959999" cy="1140479"/>
             <wp:effectExtent b="0" l="0" r="0" t="0"/>
-            <wp:docPr descr="Figura S2. Integridade do anel nas três simulações cíclicas com CHARMM36 concluídas até agora (A. gemmatalis, 10 ns): distância C–N de fechamento, ângulo ω de fechamento em valor absoluto ao longo do tempo e distribuição de ω. Linhas tracejadas: limites pré-registrados (C–N ≤ 1,5 Å, ω ≥ 150°). A versão anterior desta figura usava outro campo de força e foi retirada." title="" id="92" name="Picture"/>
+            <wp:docPr descr="Figura S2. Integridade do anel nas três simulações cíclicas com CHARMM36 concluídas até agora (A. gemmatalis, 10 ns): distância C–N de fechamento, ângulo ω de fechamento em valor absoluto ao longo do tempo e distribuição de ω. Linhas tracejadas: limites pré-registrados (C–N ≤ 1,5 Å, ω ≥ 150°). A versão anterior desta figura usava outro campo de força e foi retirada." title="" id="91" name="Picture"/>
             <a:graphic>
               <a:graphicData uri="http://schemas.openxmlformats.org/drawingml/2006/picture">
                 <pic:pic>
                   <pic:nvPicPr>
-                    <pic:cNvPr descr="figures/pt/figS2_anel_ciclico_charmm36.png" id="93" name="Picture"/>
+                    <pic:cNvPr descr="figures/pt/figS2_anel_ciclico_charmm36.png" id="92" name="Picture"/>
                     <pic:cNvPicPr>
                       <a:picLocks noChangeArrowheads="1" noChangeAspect="1"/>
                     </pic:cNvPicPr>
                   </pic:nvPicPr>
                   <pic:blipFill>
-                    <a:blip r:embed="rId91"/>
+                    <a:blip r:embed="rId90"/>
                     <a:stretch>
                       <a:fillRect/>
                     </a:stretch>
@@ -10752,570 +10636,570 @@
         <w:t xml:space="preserve">, 10 ns): distância C–N de fechamento, ângulo ω de fechamento em valor absoluto ao longo do tempo e distribuição de ω. Linhas tracejadas: limites pré-registrados (C–N ≤ 1,5 Å, ω ≥ 150°). A versão anterior desta figura usava outro campo de força e foi retirada.</w:t>
       </w:r>
     </w:p>
+    <w:bookmarkEnd w:id="93"/>
+    <w:bookmarkStart w:id="94" w:name="referências"/>
+    <w:p>
+      <w:pPr>
+        <w:pStyle w:val="Heading2"/>
+      </w:pPr>
+      <w:r>
+        <w:t xml:space="preserve">Referências</w:t>
+      </w:r>
+    </w:p>
+    <w:p>
+      <w:pPr>
+        <w:pStyle w:val="FirstParagraph"/>
+      </w:pPr>
+      <w:r>
+        <w:t xml:space="preserve">Abraham MJ, Murtola T, Schulz R, Páll S, Smith JC, Hess B, et al. (2015). GROMACS: High performance molecular simulations through multi-level parallelism from laptops to supercomputers. SoftwareX 1-2, 19-25. doi: 10.1016/j.softx.2015.06.001</w:t>
+      </w:r>
+    </w:p>
+    <w:p>
+      <w:pPr>
+        <w:pStyle w:val="BodyText"/>
+      </w:pPr>
+      <w:r>
+        <w:t xml:space="preserve">Berman HM, Westbrook J, Feng Z, Gilliland G, Bhat TN, Weissig H, et al. (2000). The Protein Data Bank. Nucleic Acids Research 28, 235-242. doi: 10.1093/nar/28.1.235</w:t>
+      </w:r>
+    </w:p>
+    <w:p>
+      <w:pPr>
+        <w:pStyle w:val="BodyText"/>
+      </w:pPr>
+      <w:r>
+        <w:t xml:space="preserve">Bussi G, Donadio D, Parrinello M (2007). Canonical sampling through velocity rescaling. The Journal of Chemical Physics 126, 014101. doi: 10.1063/1.2408420</w:t>
+      </w:r>
+    </w:p>
+    <w:p>
+      <w:pPr>
+        <w:pStyle w:val="BodyText"/>
+      </w:pPr>
+      <w:r>
+        <w:t xml:space="preserve">Carpane PD, Llebaria M, Nascimento AF, Vivan L (2022). Feeding injury of major lepidopteran soybean pests in South America. PLOS ONE 17, e0271084. doi: 10.1371/journal.pone.0271084</w:t>
+      </w:r>
+    </w:p>
+    <w:p>
+      <w:pPr>
+        <w:pStyle w:val="BodyText"/>
+      </w:pPr>
+      <w:r>
+        <w:t xml:space="preserve">Cock PJA, Antao T, Chang JT, Chapman BA, Cox CJ, Dalke A, et al. (2009). Biopython: freely available Python tools for computational molecular biology and bioinformatics. Bioinformatics 25, 1422-1423. doi: 10.1093/bioinformatics/btp163</w:t>
+      </w:r>
+    </w:p>
+    <w:p>
+      <w:pPr>
+        <w:pStyle w:val="BodyText"/>
+      </w:pPr>
+      <w:r>
+        <w:t xml:space="preserve">da Silva Júnior NR, Vital CE, de Almeida Barros R, Faustino VA, Monteiro LP, Barros E, et al. (2020). Intestinal proteolytic profile changes during larval development of Anticarsia gemmatalis caterpillars. Archives of Insect Biochemistry and Physiology 103, e21631. doi: 10.1002/arch.21631</w:t>
+      </w:r>
+    </w:p>
+    <w:p>
+      <w:pPr>
+        <w:pStyle w:val="BodyText"/>
+      </w:pPr>
+      <w:r>
+        <w:t xml:space="preserve">Dauparas J, Anishchenko I, Bennett N, Bai H, Ragotte RJ, Milles LF, et al. (2022). Robust deep learning–based protein sequence design using ProteinMPNN. Science 378, 49-56. doi: 10.1126/science.add2187</w:t>
+      </w:r>
+    </w:p>
+    <w:p>
+      <w:pPr>
+        <w:pStyle w:val="BodyText"/>
+      </w:pPr>
+      <w:r>
+        <w:t xml:space="preserve">de Almeida Barros R, Meriño-Cabrera Y, Vital CE, da Silva Júnior NR, de Oliveira CN, Lessa Barbosa S, et al. (2021). Small peptides inhibit gut trypsin-like proteases and impair Anticarsia gemmatalis (Lepidoptera: Noctuidae) survival and development. Pest Management Science 77, 1714-1723. doi: 10.1002/ps.6191</w:t>
+      </w:r>
+    </w:p>
+    <w:p>
+      <w:pPr>
+        <w:pStyle w:val="BodyText"/>
+      </w:pPr>
+      <w:r>
+        <w:t xml:space="preserve">de Almeida Barros R, Meriño-Cabrera Y, Severiche Castro JG, Rodrigues da Silva Júnior N, Schultz H, de Andrade RJ, et al. (2022). Inhibition constant and stability of tripeptide inhibitors of gut trypsin-like enzyme of the soybean pest Anticarsia gemmatalis. Archives of Insect Biochemistry and Physiology 110, e21887. doi: 10.1002/arch.21887</w:t>
+      </w:r>
+    </w:p>
+    <w:p>
+      <w:pPr>
+        <w:pStyle w:val="BodyText"/>
+      </w:pPr>
+      <w:r>
+        <w:t xml:space="preserve">de Almeida Barros R, Meriño-Cabrera Y, Castro JS, da Silva Junior NR, de Oliveira JVA, Schultz H, et al. (2022). Bovine pancreatic trypsin inhibitor and soybean Kunitz trypsin inhibitor: Differential effects on proteases and larval development of the soybean pest Anticarsia gemmatalis (Lepidoptera: Noctuidae). Pesticide Biochemistry and Physiology 187, 105188. doi: 10.1016/j.pestbp.2022.105188</w:t>
+      </w:r>
+    </w:p>
+    <w:p>
+      <w:pPr>
+        <w:pStyle w:val="BodyText"/>
+      </w:pPr>
+      <w:r>
+        <w:t xml:space="preserve">Dolinsky TJ, Czodrowski P, Li H, Nielsen JE, Jensen JH, Klebe G, et al. (2007). PDB2PQR: expanding and upgrading automated preparation of biomolecular structures for molecular simulations. Nucleic Acids Research 35, W522-W525. doi: 10.1093/nar/gkm276</w:t>
+      </w:r>
+    </w:p>
+    <w:p>
+      <w:pPr>
+        <w:pStyle w:val="BodyText"/>
+      </w:pPr>
+      <w:r>
+        <w:t xml:space="preserve">Dow JAT (1992). pH gradients in lepidopteran midgut. Journal of Experimental Biology 172, 355-375. doi: 10.1242/jeb.172.1.355</w:t>
+      </w:r>
+    </w:p>
+    <w:p>
+      <w:pPr>
+        <w:pStyle w:val="BodyText"/>
+      </w:pPr>
+      <w:r>
+        <w:t xml:space="preserve">Essmann U, Perera L, Berkowitz ML, Darden T, Lee H, Pedersen LG (1995). A smooth particle mesh Ewald method. The Journal of Chemical Physics 103, 8577-8593. doi: 10.1063/1.470117</w:t>
+      </w:r>
+    </w:p>
+    <w:p>
+      <w:pPr>
+        <w:pStyle w:val="BodyText"/>
+      </w:pPr>
+      <w:r>
+        <w:t xml:space="preserve">Gasteiger E, Hoogland C, Gattiker A, Duvaud S, Wilkins MR, Appel RD, et al. (2005). Protein Identification and Analysis Tools on the ExPASy Server. The Proteomics Protocols Handbook , 571-607. doi: 10.1385/1-59259-890-0:571</w:t>
+      </w:r>
+    </w:p>
+    <w:p>
+      <w:pPr>
+        <w:pStyle w:val="BodyText"/>
+      </w:pPr>
+      <w:r>
+        <w:t xml:space="preserve">Genheden S, Ryde U (2015). The MM/PBSA and MM/GBSA methods to estimate ligand-binding affinities. Expert Opinion on Drug Discovery 10, 449-461. doi: 10.1517/17460441.2015.1032936</w:t>
+      </w:r>
+    </w:p>
+    <w:p>
+      <w:pPr>
+        <w:pStyle w:val="BodyText"/>
+      </w:pPr>
+      <w:r>
+        <w:t xml:space="preserve">Gowers R, Linke M, Barnoud J, Reddy T, Melo M, Seyler S, et al. (2016). MDAnalysis: A Python Package for the Rapid Analysis of Molecular Dynamics Simulations. Proceedings of the Python in Science Conference , 98-105. doi: 10.25080/majora-629e541a-00e</w:t>
+      </w:r>
+    </w:p>
+    <w:p>
+      <w:pPr>
+        <w:pStyle w:val="BodyText"/>
+      </w:pPr>
+      <w:r>
+        <w:t xml:space="preserve">Hedstrom L (2002). Serine Protease Mechanism and Specificity. Chemical Reviews 102, 4501-4524. doi: 10.1021/cr000033x</w:t>
+      </w:r>
+    </w:p>
+    <w:p>
+      <w:pPr>
+        <w:pStyle w:val="BodyText"/>
+      </w:pPr>
+      <w:r>
+        <w:t xml:space="preserve">Hou T, Wang J, Li Y, Wang W (2011). Assessing the Performance of the MM/PBSA and MM/GBSA Methods. 1. The Accuracy of Binding Free Energy Calculations Based on Molecular Dynamics Simulations. Journal of Chemical Information and Modeling 51, 69-82. doi: 10.1021/ci100275a</w:t>
+      </w:r>
+    </w:p>
+    <w:p>
+      <w:pPr>
+        <w:pStyle w:val="BodyText"/>
+      </w:pPr>
+      <w:r>
+        <w:t xml:space="preserve">Huang J, MacKerell AD (2013). CHARMM36 all-atom additive protein force field: Validation based on comparison to NMR data. Journal of Computational Chemistry 34, 2135-2145. doi: 10.1002/jcc.23354</w:t>
+      </w:r>
+    </w:p>
+    <w:p>
+      <w:pPr>
+        <w:pStyle w:val="BodyText"/>
+      </w:pPr>
+      <w:r>
+        <w:t xml:space="preserve">Jongsma MA, Bakker PL, Peters J, Bosch D, Stiekema WJ (1995). Adaptation of Spodoptera exigua larvae to plant proteinase inhibitors by induction of gut proteinase activity insensitive to inhibition. Proceedings of the National Academy of Sciences 92, 8041-8045. doi: 10.1073/pnas.92.17.8041</w:t>
+      </w:r>
+    </w:p>
+    <w:p>
+      <w:pPr>
+        <w:pStyle w:val="BodyText"/>
+      </w:pPr>
+      <w:r>
+        <w:t xml:space="preserve">Jongsma MA, Bolter C (1997). The adaptation of insects to plant protease inhibitors. Journal of Insect Physiology 43, 885-895. doi: 10.1016/s0022-1910(97)00040-1</w:t>
+      </w:r>
+    </w:p>
+    <w:p>
+      <w:pPr>
+        <w:pStyle w:val="BodyText"/>
+      </w:pPr>
+      <w:r>
+        <w:t xml:space="preserve">Jorgensen WL, Chandrasekhar J, Madura JD, Impey RW, Klein ML (1983). Comparison of simple potential functions for simulating liquid water. The Journal of Chemical Physics 79, 926-935. doi: 10.1063/1.445869</w:t>
+      </w:r>
+    </w:p>
+    <w:p>
+      <w:pPr>
+        <w:pStyle w:val="BodyText"/>
+      </w:pPr>
+      <w:r>
+        <w:t xml:space="preserve">Jumper J, Evans R, Pritzel A, Green T, Figurnov M, Ronneberger O, et al. (2021). Highly accurate protein structure prediction with AlphaFold. Nature 596, 583-589. doi: 10.1038/s41586-021-03819-2</w:t>
+      </w:r>
+    </w:p>
+    <w:p>
+      <w:pPr>
+        <w:pStyle w:val="BodyText"/>
+      </w:pPr>
+      <w:r>
+        <w:t xml:space="preserve">Karumbaiah L, Oppert B, Jurat-Fuentes JL, Adang MJ (2007). Analysis of midgut proteinases from Bacillus thuringiensis-susceptible and -resistant Heliothis virescens (Lepidoptera: Noctuidae). Comparative Biochemistry and Physiology Part B: Biochemistry and Molecular Biology 146, 139-146. doi: 10.1016/j.cbpb.2006.10.104</w:t>
+      </w:r>
+    </w:p>
+    <w:p>
+      <w:pPr>
+        <w:pStyle w:val="BodyText"/>
+      </w:pPr>
+      <w:r>
+        <w:t xml:space="preserve">Kelly C, Laskowski Jr. M, Qasim M (2005). The Role of Scaffolding in Standard Mechanism Serine Proteinase Inhibitors. Protein &amp; Peptide Letters 12, 465-471. doi: 10.2174/0929866054395383</w:t>
+      </w:r>
+    </w:p>
+    <w:p>
+      <w:pPr>
+        <w:pStyle w:val="BodyText"/>
+      </w:pPr>
+      <w:r>
+        <w:t xml:space="preserve">Kuwar SS, Pauchet Y, Vogel H, Heckel DG (2015). Adaptive regulation of digestive serine proteases in the larval midgut of Helicoverpa armigera in response to a plant protease inhibitor. Insect Biochemistry and Molecular Biology 59, 18-29. doi: 10.1016/j.ibmb.2015.01.016</w:t>
+      </w:r>
+    </w:p>
+    <w:p>
+      <w:pPr>
+        <w:pStyle w:val="BodyText"/>
+      </w:pPr>
+      <w:r>
+        <w:t xml:space="preserve">Laskowski M, Kato I (1980). Protein Inhibitors of Proteinases. Annual Review of Biochemistry 49, 593-626. doi: 10.1146/annurev.bi.49.070180.003113</w:t>
+      </w:r>
+    </w:p>
+    <w:p>
+      <w:pPr>
+        <w:pStyle w:val="BodyText"/>
+      </w:pPr>
+      <w:r>
+        <w:t xml:space="preserve">Laskowski M, Qasim M (2000). What can the structures of enzyme-inhibitor complexes tell us about the structures of enzyme substrate complexes?. Biochimica et Biophysica Acta (BBA) - Protein Structure and Molecular Enzymology 1477, 324-337. doi: 10.1016/s0167-4838(99)00284-8</w:t>
+      </w:r>
+    </w:p>
+    <w:p>
+      <w:pPr>
+        <w:pStyle w:val="BodyText"/>
+      </w:pPr>
+      <w:r>
+        <w:t xml:space="preserve">Lomate PR, Dewangan V, Mahajan NS, Kumar Y, Kulkarni A, Wang L, et al. (2018). Integrated Transcriptomic and Proteomic Analyses Suggest the Participation of Endogenous Protease Inhibitors in the Regulation of Protease Gene Expression in Helicoverpa armigera. Molecular &amp; Cellular Proteomics 17, 1324-1336. doi: 10.1074/mcp.ra117.000533</w:t>
+      </w:r>
+    </w:p>
+    <w:p>
+      <w:pPr>
+        <w:pStyle w:val="BodyText"/>
+      </w:pPr>
+      <w:r>
+        <w:t xml:space="preserve">Luckett S, Garcia R, Barker J, Konarev A, Shewry P, Clarke A, et al. (1999). High-resolution structure of a potent, cyclic proteinase inhibitor from sunflower seeds. Journal of Molecular Biology 290, 525-533. doi: 10.1006/jmbi.1999.2891</w:t>
+      </w:r>
+    </w:p>
+    <w:p>
+      <w:pPr>
+        <w:pStyle w:val="BodyText"/>
+      </w:pPr>
+      <w:r>
+        <w:t xml:space="preserve">Meriño-Cabrera Y, Severiche Castro JG, Rios Diez JD, Rodrigues Macedo ML, de Oliveira Mendes TA, Goreti de Almeida Oliveira M (2020). Rational design of mimetic peptides based on the interaction between Inga laurina inhibitor and trypsins for Spodoptera cosmioides pest control. Insect Biochemistry and Molecular Biology 122, 103390. doi: 10.1016/j.ibmb.2020.103390</w:t>
+      </w:r>
+    </w:p>
+    <w:p>
+      <w:pPr>
+        <w:pStyle w:val="BodyText"/>
+      </w:pPr>
+      <w:r>
+        <w:t xml:space="preserve">Meriño-Cabrera Y, de Oliveira Mendes TA, Castro JGS, Barbosa SL, Macedo MLR, de Almeida Oliveira MG (2020). Noncompetitive tight-binding inhibition of Anticarsia gemmatalis trypsins by Adenanthera pavonina protease inhibitor affects larvae survival. Archives of Insect Biochemistry and Physiology 104, e21687. doi: 10.1002/arch.21687</w:t>
+      </w:r>
+    </w:p>
+    <w:p>
+      <w:pPr>
+        <w:pStyle w:val="BodyText"/>
+      </w:pPr>
+      <w:r>
+        <w:t xml:space="preserve">Meriño-Cabrera Y, Castro JS, de Almeida Barros R, da Silva Junior NR, de Oliveira Ramos H, de Almeida Oliveira MG (2022). Arginine-containing dipeptides decrease affinity of gut trypsins and compromise soybean pest development. Pesticide Biochemistry and Physiology 184, 105107. doi: 10.1016/j.pestbp.2022.105107</w:t>
+      </w:r>
+    </w:p>
+    <w:p>
+      <w:pPr>
+        <w:pStyle w:val="BodyText"/>
+      </w:pPr>
+      <w:r>
+        <w:t xml:space="preserve">Michaud-Agrawal N, Denning EJ, Woolf TB, Beckstein O (2011). MDAnalysis: A toolkit for the analysis of molecular dynamics simulations. Journal of Computational Chemistry 32, 2319-2327. doi: 10.1002/jcc.21787</w:t>
+      </w:r>
+    </w:p>
+    <w:p>
+      <w:pPr>
+        <w:pStyle w:val="BodyText"/>
+      </w:pPr>
+      <w:r>
+        <w:t xml:space="preserve">Mirdita M, Schütze K, Moriwaki Y, Heo L, Ovchinnikov S, Steinegger M (2022). ColabFold: making protein folding accessible to all. Nature Methods 19, 679-682. doi: 10.1038/s41592-022-01488-1</w:t>
+      </w:r>
+    </w:p>
+    <w:p>
+      <w:pPr>
+        <w:pStyle w:val="BodyText"/>
+      </w:pPr>
+      <w:r>
+        <w:t xml:space="preserve">Nakonieczny M, Michalczyk K, Kędziorski A (2007). Midgut protease activities in monophagous larvae of Apollo butterfly, Parnassius apollo ssp. frankenbergeri. Comptes Rendus. Biologies 330, 126-134. doi: 10.1016/j.crvi.2006.12.002</w:t>
+      </w:r>
+    </w:p>
+    <w:p>
+      <w:pPr>
+        <w:pStyle w:val="BodyText"/>
+      </w:pPr>
+      <w:r>
+        <w:t xml:space="preserve">Olsson MHM, Søndergaard CR, Rostkowski M, Jensen JH (2011). PROPKA3: Consistent Treatment of Internal and Surface Residues in Empirical p K a Predictions. Journal of Chemical Theory and Computation 7, 525-537. doi: 10.1021/ct100578z</w:t>
+      </w:r>
+    </w:p>
+    <w:p>
+      <w:pPr>
+        <w:pStyle w:val="BodyText"/>
+      </w:pPr>
+      <w:r>
+        <w:t xml:space="preserve">Parkin S, Rupp B, Hope H (1996). Structure of bovine pancreatic trypsin inhibitor at 125 K definition of carboxyl-terminal residues Gly57 and Ala58. Acta Crystallographica Section D Biological Crystallography 52, 18-29. doi: 10.1107/S0907444995008675</w:t>
+      </w:r>
+    </w:p>
+    <w:p>
+      <w:pPr>
+        <w:pStyle w:val="BodyText"/>
+      </w:pPr>
+      <w:r>
+        <w:t xml:space="preserve">Parrinello M, Rahman A (1981). Polymorphic transitions in single crystals: A new molecular dynamics method. Journal of Applied Physics 52, 7182-7190. doi: 10.1063/1.328693</w:t>
+      </w:r>
+    </w:p>
+    <w:p>
+      <w:pPr>
+        <w:pStyle w:val="BodyText"/>
+      </w:pPr>
+      <w:r>
+        <w:t xml:space="preserve">Passaro S, Corso G, Wohlwend J, Reveiz M, Thaler S, Ram Somnath V, et al. (2025). Boltz-2: Towards accurate and efficient binding affinity prediction. bioRxiv [Preprint]. doi: 10.1101/2025.06.14.659707</w:t>
+      </w:r>
+    </w:p>
+    <w:p>
+      <w:pPr>
+        <w:pStyle w:val="BodyText"/>
+      </w:pPr>
+      <w:r>
+        <w:t xml:space="preserve">Patarroyo-Vargas AM, Merino-Cabrera YB, Zanuncio JC, Rocha F, Campos WG, de Almeida Oliveira MG (2017). Kinetic Characterization of Anticarsia gemmatalis Digestive Serine- Proteases and the Inhibitory Effect of Synthetic Peptides. Protein &amp; Peptide Letters 24, 1040-1047. doi: 10.2174/0929866524666170918103146</w:t>
+      </w:r>
+    </w:p>
+    <w:p>
+      <w:pPr>
+        <w:pStyle w:val="BodyText"/>
+      </w:pPr>
+      <w:r>
+        <w:t xml:space="preserve">Patarroyo-Vargas AM, Cordeiro G, Silva CRD, Silva CRD, Mendonça EG, Visôtto LE, et al. (2020). Inhibition kinetics of digestive proteases for Anticarsia gemmatalis. Anais da Academia Brasileira de Ciências 92, e20180477. doi: 10.1590/0001-3765202020180477</w:t>
+      </w:r>
+    </w:p>
+    <w:p>
+      <w:pPr>
+        <w:pStyle w:val="BodyText"/>
+      </w:pPr>
+      <w:r>
+        <w:t xml:space="preserve">Paulo DGS, Schneider JR, Meriño-Cabrera Y, Wurlitzer WB, de Andrade RJ, Santos ILB, et al. (2026). Peptides Derived From Reactive Center Loops Inhibit Digestive Trypsin-Like Enzymes in Lepidopteran Pests. Archives of Insect Biochemistry and Physiology 121, e70123. doi: 10.1002/arch.70123</w:t>
+      </w:r>
+    </w:p>
+    <w:p>
+      <w:pPr>
+        <w:pStyle w:val="BodyText"/>
+      </w:pPr>
+      <w:r>
+        <w:t xml:space="preserve">Perona JJ, Craik CS (1995). Structural basis of substrate specificity in the serine proteases. Protein Science 4, 337-360. doi: 10.1002/pro.5560040301</w:t>
+      </w:r>
+    </w:p>
+    <w:p>
+      <w:pPr>
+        <w:pStyle w:val="BodyText"/>
+      </w:pPr>
+      <w:r>
+        <w:t xml:space="preserve">Rettie SA, Juergens D, Adebomi V, Bueso YF, Zhao Q, Leveille AN, et al. (2025). Accurate de novo design of high-affinity protein-binding macrocycles using deep learning. Nature Chemical Biology 21, 1948-1956. doi: 10.1038/s41589-025-01929-w</w:t>
+      </w:r>
+    </w:p>
+    <w:p>
+      <w:pPr>
+        <w:pStyle w:val="BodyText"/>
+      </w:pPr>
+      <w:r>
+        <w:t xml:space="preserve">Saikhedkar NS, Joshi RS, Bhoite AS, Mohandasan R, Yadav AK, Fernandes M, et al. (2018). Tripeptides derived from reactive centre loop of potato type II protease inhibitors preferentially inhibit midgut proteases of Helicoverpa armigera. Insect Biochemistry and Molecular Biology 95, 17-25. doi: 10.1016/j.ibmb.2018.02.001</w:t>
+      </w:r>
+    </w:p>
+    <w:p>
+      <w:pPr>
+        <w:pStyle w:val="BodyText"/>
+      </w:pPr>
+      <w:r>
+        <w:t xml:space="preserve">Saikhedkar NS, Joshi RS, Yadav AK, Seal S, Fernandes M, Giri AP (2019). Phyto-inspired cyclic peptides derived from plant Pin-II type protease inhibitor reactive center loops for crop protection from insect pests. Biochimica et Biophysica Acta (BBA) - General Subjects 1863, 1254-1262. doi: 10.1016/j.bbagen.2019.05.003</w:t>
+      </w:r>
+    </w:p>
+    <w:p>
+      <w:pPr>
+        <w:pStyle w:val="BodyText"/>
+      </w:pPr>
+      <w:r>
+        <w:t xml:space="preserve">Schechter I, Berger A (1967). On the size of the active site in proteases. I. Papain. Biochemical and Biophysical Research Communications 27, 157-162. doi: 10.1016/S0006-291X(67)80055-X</w:t>
+      </w:r>
+    </w:p>
+    <w:p>
+      <w:pPr>
+        <w:pStyle w:val="BodyText"/>
+      </w:pPr>
+      <w:r>
+        <w:t xml:space="preserve">Schultz H, Paulo DGS, Meriño-Cabrera Y, de Andrade RJ, Santos ILB, Rodrigues MCNG, et al. (2026). Synthetic Peptide Inhibition of Trypsin-Like Proteases in Spodoptera frugiperda (Lepidoptera: Noctuidae): Evaluating the Influence of Gut Microbiota. Archives of Insect Biochemistry and Physiology 121, e70145. doi: 10.1002/arch.70145</w:t>
+      </w:r>
+    </w:p>
+    <w:p>
+      <w:pPr>
+        <w:pStyle w:val="BodyText"/>
+      </w:pPr>
+      <w:r>
+        <w:t xml:space="preserve">Severiche-Castro J, Valerio MF, Oliveira MGdA (2026). Structure-Guided Design of an Interface-Derived Inhibitor Peptide Against Spodoptera frugiperda Digestive Trypsins. Archives of Insect Biochemistry and Physiology 122, e70164. doi: 10.1002/arch.70164</w:t>
+      </w:r>
+    </w:p>
+    <w:p>
+      <w:pPr>
+        <w:pStyle w:val="BodyText"/>
+      </w:pPr>
+      <w:r>
+        <w:t xml:space="preserve">Silva-Júnior NR, Cabrera YM, Barbosa SL, Barros RDA, Barros E, Vital CE, et al. (2021). Intestinal proteases profiling from Anticarsia gemmatalis and their binding to inhibitors. Archives of Insect Biochemistry and Physiology 107, e21792. doi: 10.1002/arch.21792</w:t>
+      </w:r>
+    </w:p>
+    <w:p>
+      <w:pPr>
+        <w:pStyle w:val="BodyText"/>
+      </w:pPr>
+      <w:r>
+        <w:t xml:space="preserve">Song HK, Suh SW (1998). Kunitz-type soybean trypsin inhibitor revisited: refined structure of its complex with porcine trypsin reveals an insight into the interaction between a homologous inhibitor from Erythrina caffra and tissue-type plasminogen activator. Journal of Molecular Biology 275, 347-363. doi: 10.1006/jmbi.1997.1469</w:t>
+      </w:r>
+    </w:p>
+    <w:p>
+      <w:pPr>
+        <w:pStyle w:val="BodyText"/>
+      </w:pPr>
+      <w:r>
+        <w:t xml:space="preserve">Souza TP, Dias RO, Castelhano EC, Brandão MM, Moura DS, Silva-Filho MC (2016). Comparative analysis of expression profiling of the trypsin and chymotrypsin genes from Lepidoptera species with different levels of sensitivity to soybean peptidase inhibitors. Comparative Biochemistry and Physiology Part B: Biochemistry and Molecular Biology 196-197, 67-73. doi: 10.1016/j.cbpb.2016.02.007</w:t>
+      </w:r>
+    </w:p>
+    <w:p>
+      <w:pPr>
+        <w:pStyle w:val="BodyText"/>
+      </w:pPr>
+      <w:r>
+        <w:t xml:space="preserve">Terra WR, Ferreira C (1994). Insect digestive enzymes: properties, compartmentalization and function. Comparative Biochemistry and Physiology Part B: Comparative Biochemistry 109, 1-62. doi: 10.1016/0305-0491(94)90141-4</w:t>
+      </w:r>
+    </w:p>
+    <w:p>
+      <w:pPr>
+        <w:pStyle w:val="BodyText"/>
+      </w:pPr>
+      <w:r>
+        <w:t xml:space="preserve">The UniProt Consortium, Bateman A, Martin MJ, Orchard S, Magrane M, Adesina A, et al. (2025). UniProt: the Universal Protein Knowledgebase in 2025. Nucleic Acids Research 53, D609-D617. doi: 10.1093/nar/gkae1010</w:t>
+      </w:r>
+    </w:p>
+    <w:p>
+      <w:pPr>
+        <w:pStyle w:val="BodyText"/>
+      </w:pPr>
+      <w:r>
+        <w:t xml:space="preserve">Valaitis AP (1995). Gypsy moth midgut proteinases: Purification and characterization of luminal trypsin, elastase and the brush border membrane leucine aminopeptidase. Insect Biochemistry and Molecular Biology 25, 139-149. doi: 10.1016/0965-1748(94)00033-e</w:t>
+      </w:r>
+    </w:p>
+    <w:p>
+      <w:pPr>
+        <w:pStyle w:val="BodyText"/>
+      </w:pPr>
+      <w:r>
+        <w:t xml:space="preserve">Valaitis AP, Augustin S, Clancy KM (1999). Purification and characterization of the western spruce budworm larval midgut proteinases and comparison of gut activities of laboratory-reared and field-collected insects. Insect Biochemistry and Molecular Biology 29, 405-415. doi: 10.1016/s0965-1748(99)00017-x</w:t>
+      </w:r>
+    </w:p>
+    <w:p>
+      <w:pPr>
+        <w:pStyle w:val="BodyText"/>
+      </w:pPr>
+      <w:r>
+        <w:t xml:space="preserve">Valdés-Tresanco MS, Valdés-Tresanco ME, Valiente PA, Moreno E (2021). gmx_MMPBSA: A New Tool to Perform End-State Free Energy Calculations with GROMACS. Journal of Chemical Theory and Computation 17, 6281-6291. doi: 10.1021/acs.jctc.1c00645</w:t>
+      </w:r>
+    </w:p>
+    <w:p>
+      <w:pPr>
+        <w:pStyle w:val="BodyText"/>
+      </w:pPr>
+      <w:r>
+        <w:t xml:space="preserve">van Kempen M, Kim SS, Tumescheit C, Mirdita M, Lee J, Gilchrist CLM, et al. (2024). Fast and accurate protein structure search with Foldseek. Nature Biotechnology 42, 243-246. doi: 10.1038/s41587-023-01773-0</w:t>
+      </w:r>
+    </w:p>
+    <w:p>
+      <w:pPr>
+        <w:pStyle w:val="BodyText"/>
+      </w:pPr>
+      <w:r>
+        <w:t xml:space="preserve">Varadi M, Bertoni D, Magana P, Paramval U, Pidruchna I, Radhakrishnan M, et al. (2024). AlphaFold Protein Structure Database in 2024: providing structure coverage for over 214 million protein sequences. Nucleic Acids Research 52, D368-D375. doi: 10.1093/nar/gkad1011</w:t>
+      </w:r>
+    </w:p>
+    <w:p>
+      <w:pPr>
+        <w:pStyle w:val="BodyText"/>
+      </w:pPr>
+      <w:r>
+        <w:t xml:space="preserve">Wacha AF, Lemkul JA (2023). charmm2gmx: An Automated Method to Port the CHARMM Additive Force Field to GROMACS. Journal of Chemical Information and Modeling 63, 4246-4252. doi: 10.1021/acs.jcim.3c00860</w:t>
+      </w:r>
+    </w:p>
+    <w:p>
+      <w:pPr>
+        <w:pStyle w:val="BodyText"/>
+      </w:pPr>
+      <w:r>
+        <w:t xml:space="preserve">Watson JL, Juergens D, Bennett NR, Trippe BL, Yim J, Eisenach HE, et al. (2023). De novo design of protein structure and function with RFdiffusion. Nature 620, 1089-1100. doi: 10.1038/s41586-023-06415-8</w:t>
+      </w:r>
+    </w:p>
+    <w:p>
+      <w:pPr>
+        <w:pStyle w:val="BodyText"/>
+      </w:pPr>
+      <w:r>
+        <w:t xml:space="preserve">Werner MH, Wemmer DE (1992). Three-dimensional structure of soybean trypsin/chymotrypsin Bowman-Birk inhibitor in solution. Biochemistry 31, 999-1010. doi: 10.1021/bi00119a008</w:t>
+      </w:r>
+    </w:p>
+    <w:p>
+      <w:pPr>
+        <w:pStyle w:val="BodyText"/>
+      </w:pPr>
+      <w:r>
+        <w:t xml:space="preserve">Wohlwend J, Corso G, Passaro S, Getz N, Reveiz M, Leidal K, et al. (2024). Boltz-1: Democratizing biomolecular interaction modeling. bioRxiv [Preprint]. doi: 10.1101/2024.11.19.624167</w:t>
+      </w:r>
+    </w:p>
+    <w:p>
+      <w:pPr>
+        <w:pStyle w:val="BodyText"/>
+      </w:pPr>
+      <w:r>
+        <w:t xml:space="preserve">Xu X, Zhou F, Zheng L, Wang S, Peng X, Li D (2025). Sampling Challenges of MM/PBSA Binding Energy Calculations. The Journal of Physical Chemistry B 129, 11666-11678. doi: 10.1021/acs.jpcb.5c04908</w:t>
+      </w:r>
+    </w:p>
+    <w:p>
+      <w:pPr>
+        <w:pStyle w:val="BodyText"/>
+      </w:pPr>
+      <w:r>
+        <w:t xml:space="preserve">Yang Y, Zhu YC, Ottea J, Husseneder C, Leonard BR, Abel C, et al. (2012). Characterization and transcriptional analyses of cDNAs encoding three trypsin- and chymotrypsin-like proteinases in Cry1Ab-susceptible and Cry1Ab-resistant strains of sugarcane borer, Diatraea saccharalis. Insect Science 20, 485-496. doi: 10.1111/j.1744-7917.2012.01514.x</w:t>
+      </w:r>
+    </w:p>
+    <w:p>
+      <w:pPr>
+        <w:pStyle w:val="BodyText"/>
+      </w:pPr>
+      <w:r>
+        <w:t xml:space="preserve">Zhan Q, Zheng S, Feng Q, Liu L (2010). A midgut-specific chymotrypsin cDNA (Slctlp1) from Spodoptera litura: cloning, characterization, localization and expression analysis. Archives of Insect Biochemistry and Physiology 76, 130-143. doi: 10.1002/arch.20353</w:t>
+      </w:r>
+    </w:p>
+    <w:p>
+      <w:pPr>
+        <w:pStyle w:val="BodyText"/>
+      </w:pPr>
+      <w:r>
+        <w:t xml:space="preserve">Zhang Y, Skolnick J (2005). TM-align: a protein structure alignment algorithm based on the TM-score. Nucleic Acids Research 33, 2302-2309. doi: 10.1093/nar/gki524</w:t>
+      </w:r>
+    </w:p>
+    <w:p>
+      <w:pPr>
+        <w:pStyle w:val="BodyText"/>
+      </w:pPr>
+      <w:r>
+        <w:t xml:space="preserve">Zhou D, Lobo YA, Batista IFC, Marques-Porto R, Gustchina A, Oliva MLV, et al. (2013). Crystal Structures of a Plant Trypsin Inhibitor from Enterolobium contortisiliquum (EcTI) and of Its Complex with Bovine Trypsin. PLoS ONE 8, e62252. doi: 10.1371/journal.pone.0062252</w:t>
+      </w:r>
+    </w:p>
     <w:bookmarkEnd w:id="94"/>
-    <w:bookmarkStart w:id="95" w:name="referências"/>
-    <w:p>
-      <w:pPr>
-        <w:pStyle w:val="Heading2"/>
-      </w:pPr>
-      <w:r>
-        <w:t xml:space="preserve">Referências</w:t>
-      </w:r>
-    </w:p>
-    <w:p>
-      <w:pPr>
-        <w:pStyle w:val="FirstParagraph"/>
-      </w:pPr>
-      <w:r>
-        <w:t xml:space="preserve">Abraham MJ, Murtola T, Schulz R, Páll S, Smith JC, Hess B, et al. (2015). GROMACS: High performance molecular simulations through multi-level parallelism from laptops to supercomputers. SoftwareX 1-2, 19-25. doi: 10.1016/j.softx.2015.06.001</w:t>
-      </w:r>
-    </w:p>
-    <w:p>
-      <w:pPr>
-        <w:pStyle w:val="BodyText"/>
-      </w:pPr>
-      <w:r>
-        <w:t xml:space="preserve">Berman HM, Westbrook J, Feng Z, Gilliland G, Bhat TN, Weissig H, et al. (2000). The Protein Data Bank. Nucleic Acids Research 28, 235-242. doi: 10.1093/nar/28.1.235</w:t>
-      </w:r>
-    </w:p>
-    <w:p>
-      <w:pPr>
-        <w:pStyle w:val="BodyText"/>
-      </w:pPr>
-      <w:r>
-        <w:t xml:space="preserve">Bussi G, Donadio D, Parrinello M (2007). Canonical sampling through velocity rescaling. The Journal of Chemical Physics 126, 014101. doi: 10.1063/1.2408420</w:t>
-      </w:r>
-    </w:p>
-    <w:p>
-      <w:pPr>
-        <w:pStyle w:val="BodyText"/>
-      </w:pPr>
-      <w:r>
-        <w:t xml:space="preserve">Carpane PD, Llebaria M, Nascimento AF, Vivan L (2022). Feeding injury of major lepidopteran soybean pests in South America. PLOS ONE 17, e0271084. doi: 10.1371/journal.pone.0271084</w:t>
-      </w:r>
-    </w:p>
-    <w:p>
-      <w:pPr>
-        <w:pStyle w:val="BodyText"/>
-      </w:pPr>
-      <w:r>
-        <w:t xml:space="preserve">Cock PJA, Antao T, Chang JT, Chapman BA, Cox CJ, Dalke A, et al. (2009). Biopython: freely available Python tools for computational molecular biology and bioinformatics. Bioinformatics 25, 1422-1423. doi: 10.1093/bioinformatics/btp163</w:t>
-      </w:r>
-    </w:p>
-    <w:p>
-      <w:pPr>
-        <w:pStyle w:val="BodyText"/>
-      </w:pPr>
-      <w:r>
-        <w:t xml:space="preserve">da Silva Júnior NR, Vital CE, de Almeida Barros R, Faustino VA, Monteiro LP, Barros E, et al. (2020). Intestinal proteolytic profile changes during larval development of Anticarsia gemmatalis caterpillars. Archives of Insect Biochemistry and Physiology 103, e21631. doi: 10.1002/arch.21631</w:t>
-      </w:r>
-    </w:p>
-    <w:p>
-      <w:pPr>
-        <w:pStyle w:val="BodyText"/>
-      </w:pPr>
-      <w:r>
-        <w:t xml:space="preserve">Dauparas J, Anishchenko I, Bennett N, Bai H, Ragotte RJ, Milles LF, et al. (2022). Robust deep learning–based protein sequence design using ProteinMPNN. Science 378, 49-56. doi: 10.1126/science.add2187</w:t>
-      </w:r>
-    </w:p>
-    <w:p>
-      <w:pPr>
-        <w:pStyle w:val="BodyText"/>
-      </w:pPr>
-      <w:r>
-        <w:t xml:space="preserve">de Almeida Barros R, Meriño-Cabrera Y, Vital CE, da Silva Júnior NR, de Oliveira CN, Lessa Barbosa S, et al. (2021). Small peptides inhibit gut trypsin-like proteases and impair Anticarsia gemmatalis (Lepidoptera: Noctuidae) survival and development. Pest Management Science 77, 1714-1723. doi: 10.1002/ps.6191</w:t>
-      </w:r>
-    </w:p>
-    <w:p>
-      <w:pPr>
-        <w:pStyle w:val="BodyText"/>
-      </w:pPr>
-      <w:r>
-        <w:t xml:space="preserve">de Almeida Barros R, Meriño-Cabrera Y, Severiche Castro JG, Rodrigues da Silva Júnior N, Schultz H, de Andrade RJ, et al. (2022). Inhibition constant and stability of tripeptide inhibitors of gut trypsin-like enzyme of the soybean pest Anticarsia gemmatalis. Archives of Insect Biochemistry and Physiology 110, e21887. doi: 10.1002/arch.21887</w:t>
-      </w:r>
-    </w:p>
-    <w:p>
-      <w:pPr>
-        <w:pStyle w:val="BodyText"/>
-      </w:pPr>
-      <w:r>
-        <w:t xml:space="preserve">de Almeida Barros R, Meriño-Cabrera Y, Castro JS, da Silva Junior NR, de Oliveira JVA, Schultz H, et al. (2022). Bovine pancreatic trypsin inhibitor and soybean Kunitz trypsin inhibitor: Differential effects on proteases and larval development of the soybean pest Anticarsia gemmatalis (Lepidoptera: Noctuidae). Pesticide Biochemistry and Physiology 187, 105188. doi: 10.1016/j.pestbp.2022.105188</w:t>
-      </w:r>
-    </w:p>
-    <w:p>
-      <w:pPr>
-        <w:pStyle w:val="BodyText"/>
-      </w:pPr>
-      <w:r>
-        <w:t xml:space="preserve">Dolinsky TJ, Czodrowski P, Li H, Nielsen JE, Jensen JH, Klebe G, et al. (2007). PDB2PQR: expanding and upgrading automated preparation of biomolecular structures for molecular simulations. Nucleic Acids Research 35, W522-W525. doi: 10.1093/nar/gkm276</w:t>
-      </w:r>
-    </w:p>
-    <w:p>
-      <w:pPr>
-        <w:pStyle w:val="BodyText"/>
-      </w:pPr>
-      <w:r>
-        <w:t xml:space="preserve">Dow JAT (1992). pH gradients in lepidopteran midgut. Journal of Experimental Biology 172, 355-375. doi: 10.1242/jeb.172.1.355</w:t>
-      </w:r>
-    </w:p>
-    <w:p>
-      <w:pPr>
-        <w:pStyle w:val="BodyText"/>
-      </w:pPr>
-      <w:r>
-        <w:t xml:space="preserve">Essmann U, Perera L, Berkowitz ML, Darden T, Lee H, Pedersen LG (1995). A smooth particle mesh Ewald method. The Journal of Chemical Physics 103, 8577-8593. doi: 10.1063/1.470117</w:t>
-      </w:r>
-    </w:p>
-    <w:p>
-      <w:pPr>
-        <w:pStyle w:val="BodyText"/>
-      </w:pPr>
-      <w:r>
-        <w:t xml:space="preserve">Gasteiger E, Hoogland C, Gattiker A, Duvaud S, Wilkins MR, Appel RD, et al. (2005). Protein Identification and Analysis Tools on the ExPASy Server. The Proteomics Protocols Handbook , 571-607. doi: 10.1385/1-59259-890-0:571</w:t>
-      </w:r>
-    </w:p>
-    <w:p>
-      <w:pPr>
-        <w:pStyle w:val="BodyText"/>
-      </w:pPr>
-      <w:r>
-        <w:t xml:space="preserve">Genheden S, Ryde U (2015). The MM/PBSA and MM/GBSA methods to estimate ligand-binding affinities. Expert Opinion on Drug Discovery 10, 449-461. doi: 10.1517/17460441.2015.1032936</w:t>
-      </w:r>
-    </w:p>
-    <w:p>
-      <w:pPr>
-        <w:pStyle w:val="BodyText"/>
-      </w:pPr>
-      <w:r>
-        <w:t xml:space="preserve">Gowers R, Linke M, Barnoud J, Reddy T, Melo M, Seyler S, et al. (2016). MDAnalysis: A Python Package for the Rapid Analysis of Molecular Dynamics Simulations. Proceedings of the Python in Science Conference , 98-105. doi: 10.25080/majora-629e541a-00e</w:t>
-      </w:r>
-    </w:p>
-    <w:p>
-      <w:pPr>
-        <w:pStyle w:val="BodyText"/>
-      </w:pPr>
-      <w:r>
-        <w:t xml:space="preserve">Hedstrom L (2002). Serine Protease Mechanism and Specificity. Chemical Reviews 102, 4501-4524. doi: 10.1021/cr000033x</w:t>
-      </w:r>
-    </w:p>
-    <w:p>
-      <w:pPr>
-        <w:pStyle w:val="BodyText"/>
-      </w:pPr>
-      <w:r>
-        <w:t xml:space="preserve">Hou T, Wang J, Li Y, Wang W (2011). Assessing the Performance of the MM/PBSA and MM/GBSA Methods. 1. The Accuracy of Binding Free Energy Calculations Based on Molecular Dynamics Simulations. Journal of Chemical Information and Modeling 51, 69-82. doi: 10.1021/ci100275a</w:t>
-      </w:r>
-    </w:p>
-    <w:p>
-      <w:pPr>
-        <w:pStyle w:val="BodyText"/>
-      </w:pPr>
-      <w:r>
-        <w:t xml:space="preserve">Huang J, MacKerell AD (2013). CHARMM36 all-atom additive protein force field: Validation based on comparison to NMR data. Journal of Computational Chemistry 34, 2135-2145. doi: 10.1002/jcc.23354</w:t>
-      </w:r>
-    </w:p>
-    <w:p>
-      <w:pPr>
-        <w:pStyle w:val="BodyText"/>
-      </w:pPr>
-      <w:r>
-        <w:t xml:space="preserve">Jongsma MA, Bakker PL, Peters J, Bosch D, Stiekema WJ (1995). Adaptation of Spodoptera exigua larvae to plant proteinase inhibitors by induction of gut proteinase activity insensitive to inhibition. Proceedings of the National Academy of Sciences 92, 8041-8045. doi: 10.1073/pnas.92.17.8041</w:t>
-      </w:r>
-    </w:p>
-    <w:p>
-      <w:pPr>
-        <w:pStyle w:val="BodyText"/>
-      </w:pPr>
-      <w:r>
-        <w:t xml:space="preserve">Jongsma MA, Bolter C (1997). The adaptation of insects to plant protease inhibitors. Journal of Insect Physiology 43, 885-895. doi: 10.1016/s0022-1910(97)00040-1</w:t>
-      </w:r>
-    </w:p>
-    <w:p>
-      <w:pPr>
-        <w:pStyle w:val="BodyText"/>
-      </w:pPr>
-      <w:r>
-        <w:t xml:space="preserve">Jorgensen WL, Chandrasekhar J, Madura JD, Impey RW, Klein ML (1983). Comparison of simple potential functions for simulating liquid water. The Journal of Chemical Physics 79, 926-935. doi: 10.1063/1.445869</w:t>
-      </w:r>
-    </w:p>
-    <w:p>
-      <w:pPr>
-        <w:pStyle w:val="BodyText"/>
-      </w:pPr>
-      <w:r>
-        <w:t xml:space="preserve">Jumper J, Evans R, Pritzel A, Green T, Figurnov M, Ronneberger O, et al. (2021). Highly accurate protein structure prediction with AlphaFold. Nature 596, 583-589. doi: 10.1038/s41586-021-03819-2</w:t>
-      </w:r>
-    </w:p>
-    <w:p>
-      <w:pPr>
-        <w:pStyle w:val="BodyText"/>
-      </w:pPr>
-      <w:r>
-        <w:t xml:space="preserve">Karumbaiah L, Oppert B, Jurat-Fuentes JL, Adang MJ (2007). Analysis of midgut proteinases from Bacillus thuringiensis-susceptible and -resistant Heliothis virescens (Lepidoptera: Noctuidae). Comparative Biochemistry and Physiology Part B: Biochemistry and Molecular Biology 146, 139-146. doi: 10.1016/j.cbpb.2006.10.104</w:t>
-      </w:r>
-    </w:p>
-    <w:p>
-      <w:pPr>
-        <w:pStyle w:val="BodyText"/>
-      </w:pPr>
-      <w:r>
-        <w:t xml:space="preserve">Kelly C, Laskowski Jr. M, Qasim M (2005). The Role of Scaffolding in Standard Mechanism Serine Proteinase Inhibitors. Protein &amp; Peptide Letters 12, 465-471. doi: 10.2174/0929866054395383</w:t>
-      </w:r>
-    </w:p>
-    <w:p>
-      <w:pPr>
-        <w:pStyle w:val="BodyText"/>
-      </w:pPr>
-      <w:r>
-        <w:t xml:space="preserve">Kuwar SS, Pauchet Y, Vogel H, Heckel DG (2015). Adaptive regulation of digestive serine proteases in the larval midgut of Helicoverpa armigera in response to a plant protease inhibitor. Insect Biochemistry and Molecular Biology 59, 18-29. doi: 10.1016/j.ibmb.2015.01.016</w:t>
-      </w:r>
-    </w:p>
-    <w:p>
-      <w:pPr>
-        <w:pStyle w:val="BodyText"/>
-      </w:pPr>
-      <w:r>
-        <w:t xml:space="preserve">Laskowski M, Kato I (1980). Protein Inhibitors of Proteinases. Annual Review of Biochemistry 49, 593-626. doi: 10.1146/annurev.bi.49.070180.003113</w:t>
-      </w:r>
-    </w:p>
-    <w:p>
-      <w:pPr>
-        <w:pStyle w:val="BodyText"/>
-      </w:pPr>
-      <w:r>
-        <w:t xml:space="preserve">Laskowski M, Qasim M (2000). What can the structures of enzyme-inhibitor complexes tell us about the structures of enzyme substrate complexes?. Biochimica et Biophysica Acta (BBA) - Protein Structure and Molecular Enzymology 1477, 324-337. doi: 10.1016/s0167-4838(99)00284-8</w:t>
-      </w:r>
-    </w:p>
-    <w:p>
-      <w:pPr>
-        <w:pStyle w:val="BodyText"/>
-      </w:pPr>
-      <w:r>
-        <w:t xml:space="preserve">Lomate PR, Dewangan V, Mahajan NS, Kumar Y, Kulkarni A, Wang L, et al. (2018). Integrated Transcriptomic and Proteomic Analyses Suggest the Participation of Endogenous Protease Inhibitors in the Regulation of Protease Gene Expression in Helicoverpa armigera. Molecular &amp; Cellular Proteomics 17, 1324-1336. doi: 10.1074/mcp.ra117.000533</w:t>
-      </w:r>
-    </w:p>
-    <w:p>
-      <w:pPr>
-        <w:pStyle w:val="BodyText"/>
-      </w:pPr>
-      <w:r>
-        <w:t xml:space="preserve">Luckett S, Garcia R, Barker J, Konarev A, Shewry P, Clarke A, et al. (1999). High-resolution structure of a potent, cyclic proteinase inhibitor from sunflower seeds. Journal of Molecular Biology 290, 525-533. doi: 10.1006/jmbi.1999.2891</w:t>
-      </w:r>
-    </w:p>
-    <w:p>
-      <w:pPr>
-        <w:pStyle w:val="BodyText"/>
-      </w:pPr>
-      <w:r>
-        <w:t xml:space="preserve">Meriño-Cabrera Y, Severiche Castro JG, Rios Diez JD, Rodrigues Macedo ML, de Oliveira Mendes TA, Goreti de Almeida Oliveira M (2020). Rational design of mimetic peptides based on the interaction between Inga laurina inhibitor and trypsins for Spodoptera cosmioides pest control. Insect Biochemistry and Molecular Biology 122, 103390. doi: 10.1016/j.ibmb.2020.103390</w:t>
-      </w:r>
-    </w:p>
-    <w:p>
-      <w:pPr>
-        <w:pStyle w:val="BodyText"/>
-      </w:pPr>
-      <w:r>
-        <w:t xml:space="preserve">Meriño-Cabrera Y, de Oliveira Mendes TA, Castro JGS, Barbosa SL, Macedo MLR, de Almeida Oliveira MG (2020). Noncompetitive tight-binding inhibition of Anticarsia gemmatalis trypsins by Adenanthera pavonina protease inhibitor affects larvae survival. Archives of Insect Biochemistry and Physiology 104, e21687. doi: 10.1002/arch.21687</w:t>
-      </w:r>
-    </w:p>
-    <w:p>
-      <w:pPr>
-        <w:pStyle w:val="BodyText"/>
-      </w:pPr>
-      <w:r>
-        <w:t xml:space="preserve">Meriño-Cabrera Y, Castro JS, de Almeida Barros R, da Silva Junior NR, de Oliveira Ramos H, de Almeida Oliveira MG (2022). Arginine-containing dipeptides decrease affinity of gut trypsins and compromise soybean pest development. Pesticide Biochemistry and Physiology 184, 105107. doi: 10.1016/j.pestbp.2022.105107</w:t>
-      </w:r>
-    </w:p>
-    <w:p>
-      <w:pPr>
-        <w:pStyle w:val="BodyText"/>
-      </w:pPr>
-      <w:r>
-        <w:t xml:space="preserve">Michaud-Agrawal N, Denning EJ, Woolf TB, Beckstein O (2011). MDAnalysis: A toolkit for the analysis of molecular dynamics simulations. Journal of Computational Chemistry 32, 2319-2327. doi: 10.1002/jcc.21787</w:t>
-      </w:r>
-    </w:p>
-    <w:p>
-      <w:pPr>
-        <w:pStyle w:val="BodyText"/>
-      </w:pPr>
-      <w:r>
-        <w:t xml:space="preserve">Mirdita M, Schütze K, Moriwaki Y, Heo L, Ovchinnikov S, Steinegger M (2022). ColabFold: making protein folding accessible to all. Nature Methods 19, 679-682. doi: 10.1038/s41592-022-01488-1</w:t>
-      </w:r>
-    </w:p>
-    <w:p>
-      <w:pPr>
-        <w:pStyle w:val="BodyText"/>
-      </w:pPr>
-      <w:r>
-        <w:t xml:space="preserve">Nakonieczny M, Michalczyk K, Kędziorski A (2007). Midgut protease activities in monophagous larvae of Apollo butterfly, Parnassius apollo ssp. frankenbergeri. Comptes Rendus. Biologies 330, 126-134. doi: 10.1016/j.crvi.2006.12.002</w:t>
-      </w:r>
-    </w:p>
-    <w:p>
-      <w:pPr>
-        <w:pStyle w:val="BodyText"/>
-      </w:pPr>
-      <w:r>
-        <w:t xml:space="preserve">Olsson MHM, Søndergaard CR, Rostkowski M, Jensen JH (2011). PROPKA3: Consistent Treatment of Internal and Surface Residues in Empirical p K a Predictions. Journal of Chemical Theory and Computation 7, 525-537. doi: 10.1021/ct100578z</w:t>
-      </w:r>
-    </w:p>
-    <w:p>
-      <w:pPr>
-        <w:pStyle w:val="BodyText"/>
-      </w:pPr>
-      <w:r>
-        <w:t xml:space="preserve">Parkin S, Rupp B, Hope H (1996). Structure of bovine pancreatic trypsin inhibitor at 125 K definition of carboxyl-terminal residues Gly57 and Ala58. Acta Crystallographica Section D Biological Crystallography 52, 18-29. doi: 10.1107/S0907444995008675</w:t>
-      </w:r>
-    </w:p>
-    <w:p>
-      <w:pPr>
-        <w:pStyle w:val="BodyText"/>
-      </w:pPr>
-      <w:r>
-        <w:t xml:space="preserve">Parrinello M, Rahman A (1981). Polymorphic transitions in single crystals: A new molecular dynamics method. Journal of Applied Physics 52, 7182-7190. doi: 10.1063/1.328693</w:t>
-      </w:r>
-    </w:p>
-    <w:p>
-      <w:pPr>
-        <w:pStyle w:val="BodyText"/>
-      </w:pPr>
-      <w:r>
-        <w:t xml:space="preserve">Passaro S, Corso G, Wohlwend J, Reveiz M, Thaler S, Ram Somnath V, et al. (2025). Boltz-2: Towards accurate and efficient binding affinity prediction. bioRxiv [Preprint]. doi: 10.1101/2025.06.14.659707</w:t>
-      </w:r>
-    </w:p>
-    <w:p>
-      <w:pPr>
-        <w:pStyle w:val="BodyText"/>
-      </w:pPr>
-      <w:r>
-        <w:t xml:space="preserve">Patarroyo-Vargas AM, Merino-Cabrera YB, Zanuncio JC, Rocha F, Campos WG, de Almeida Oliveira MG (2017). Kinetic Characterization of Anticarsia gemmatalis Digestive Serine- Proteases and the Inhibitory Effect of Synthetic Peptides. Protein &amp; Peptide Letters 24, 1040-1047. doi: 10.2174/0929866524666170918103146</w:t>
-      </w:r>
-    </w:p>
-    <w:p>
-      <w:pPr>
-        <w:pStyle w:val="BodyText"/>
-      </w:pPr>
-      <w:r>
-        <w:t xml:space="preserve">Patarroyo-Vargas AM, Cordeiro G, Silva CRD, Silva CRD, Mendonça EG, Visôtto LE, et al. (2020). Inhibition kinetics of digestive proteases for Anticarsia gemmatalis. Anais da Academia Brasileira de Ciências 92, e20180477. doi: 10.1590/0001-3765202020180477</w:t>
-      </w:r>
-    </w:p>
-    <w:p>
-      <w:pPr>
-        <w:pStyle w:val="BodyText"/>
-      </w:pPr>
-      <w:r>
-        <w:t xml:space="preserve">Paulo DGS, Schneider JR, Meriño-Cabrera Y, Wurlitzer WB, de Andrade RJ, Santos ILB, et al. (2026). Peptides Derived From Reactive Center Loops Inhibit Digestive Trypsin-Like Enzymes in Lepidopteran Pests. Archives of Insect Biochemistry and Physiology 121, e70123. doi: 10.1002/arch.70123</w:t>
-      </w:r>
-    </w:p>
-    <w:p>
-      <w:pPr>
-        <w:pStyle w:val="BodyText"/>
-      </w:pPr>
-      <w:r>
-        <w:t xml:space="preserve">Perona JJ, Craik CS (1995). Structural basis of substrate specificity in the serine proteases. Protein Science 4, 337-360. doi: 10.1002/pro.5560040301</w:t>
-      </w:r>
-    </w:p>
-    <w:p>
-      <w:pPr>
-        <w:pStyle w:val="BodyText"/>
-      </w:pPr>
-      <w:r>
-        <w:t xml:space="preserve">Rettie SA, Juergens D, Adebomi V, Bueso YF, Zhao Q, Leveille AN, et al. (2025). Accurate de novo design of high-affinity protein-binding macrocycles using deep learning. Nature Chemical Biology 21, 1948-1956. doi: 10.1038/s41589-025-01929-w</w:t>
-      </w:r>
-    </w:p>
-    <w:p>
-      <w:pPr>
-        <w:pStyle w:val="BodyText"/>
-      </w:pPr>
-      <w:r>
-        <w:t xml:space="preserve">Saikhedkar NS, Joshi RS, Bhoite AS, Mohandasan R, Yadav AK, Fernandes M, et al. (2018). Tripeptides derived from reactive centre loop of potato type II protease inhibitors preferentially inhibit midgut proteases of Helicoverpa armigera. Insect Biochemistry and Molecular Biology 95, 17-25. doi: 10.1016/j.ibmb.2018.02.001</w:t>
-      </w:r>
-    </w:p>
-    <w:p>
-      <w:pPr>
-        <w:pStyle w:val="BodyText"/>
-      </w:pPr>
-      <w:r>
-        <w:t xml:space="preserve">Saikhedkar NS, Joshi RS, Yadav AK, Seal S, Fernandes M, Giri AP (2019). Phyto-inspired cyclic peptides derived from plant Pin-II type protease inhibitor reactive center loops for crop protection from insect pests. Biochimica et Biophysica Acta (BBA) - General Subjects 1863, 1254-1262. doi: 10.1016/j.bbagen.2019.05.003</w:t>
-      </w:r>
-    </w:p>
-    <w:p>
-      <w:pPr>
-        <w:pStyle w:val="BodyText"/>
-      </w:pPr>
-      <w:r>
-        <w:t xml:space="preserve">Schechter I, Berger A (1967). On the size of the active site in proteases. I. Papain. Biochemical and Biophysical Research Communications 27, 157-162. doi: 10.1016/S0006-291X(67)80055-X</w:t>
-      </w:r>
-    </w:p>
-    <w:p>
-      <w:pPr>
-        <w:pStyle w:val="BodyText"/>
-      </w:pPr>
-      <w:r>
-        <w:t xml:space="preserve">Schultz H, Paulo DGS, Meriño-Cabrera Y, de Andrade RJ, Santos ILB, Rodrigues MCNG, et al. (2026). Synthetic Peptide Inhibition of Trypsin-Like Proteases in Spodoptera frugiperda (Lepidoptera: Noctuidae): Evaluating the Influence of Gut Microbiota. Archives of Insect Biochemistry and Physiology 121, e70145. doi: 10.1002/arch.70145</w:t>
-      </w:r>
-    </w:p>
-    <w:p>
-      <w:pPr>
-        <w:pStyle w:val="BodyText"/>
-      </w:pPr>
-      <w:r>
-        <w:t xml:space="preserve">Severiche-Castro J, Valerio MF, Oliveira MGdA (2026). Structure-Guided Design of an Interface-Derived Inhibitor Peptide Against Spodoptera frugiperda Digestive Trypsins. Archives of Insect Biochemistry and Physiology 122, e70164. doi: 10.1002/arch.70164</w:t>
-      </w:r>
-    </w:p>
-    <w:p>
-      <w:pPr>
-        <w:pStyle w:val="BodyText"/>
-      </w:pPr>
-      <w:r>
-        <w:t xml:space="preserve">Silva-Júnior NR, Cabrera YM, Barbosa SL, Barros RDA, Barros E, Vital CE, et al. (2021). Intestinal proteases profiling from Anticarsia gemmatalis and their binding to inhibitors. Archives of Insect Biochemistry and Physiology 107, e21792. doi: 10.1002/arch.21792</w:t>
-      </w:r>
-    </w:p>
-    <w:p>
-      <w:pPr>
-        <w:pStyle w:val="BodyText"/>
-      </w:pPr>
-      <w:r>
-        <w:t xml:space="preserve">Song HK, Suh SW (1998). Kunitz-type soybean trypsin inhibitor revisited: refined structure of its complex with porcine trypsin reveals an insight into the interaction between a homologous inhibitor from Erythrina caffra and tissue-type plasminogen activator. Journal of Molecular Biology 275, 347-363. doi: 10.1006/jmbi.1997.1469</w:t>
-      </w:r>
-    </w:p>
-    <w:p>
-      <w:pPr>
-        <w:pStyle w:val="BodyText"/>
-      </w:pPr>
-      <w:r>
-        <w:t xml:space="preserve">Souza TP, Dias RO, Castelhano EC, Brandão MM, Moura DS, Silva-Filho MC (2016). Comparative analysis of expression profiling of the trypsin and chymotrypsin genes from Lepidoptera species with different levels of sensitivity to soybean peptidase inhibitors. Comparative Biochemistry and Physiology Part B: Biochemistry and Molecular Biology 196-197, 67-73. doi: 10.1016/j.cbpb.2016.02.007</w:t>
-      </w:r>
-    </w:p>
-    <w:p>
-      <w:pPr>
-        <w:pStyle w:val="BodyText"/>
-      </w:pPr>
-      <w:r>
-        <w:t xml:space="preserve">Terra WR, Ferreira C (1994). Insect digestive enzymes: properties, compartmentalization and function. Comparative Biochemistry and Physiology Part B: Comparative Biochemistry 109, 1-62. doi: 10.1016/0305-0491(94)90141-4</w:t>
-      </w:r>
-    </w:p>
-    <w:p>
-      <w:pPr>
-        <w:pStyle w:val="BodyText"/>
-      </w:pPr>
-      <w:r>
-        <w:t xml:space="preserve">The UniProt Consortium, Bateman A, Martin MJ, Orchard S, Magrane M, Adesina A, et al. (2025). UniProt: the Universal Protein Knowledgebase in 2025. Nucleic Acids Research 53, D609-D617. doi: 10.1093/nar/gkae1010</w:t>
-      </w:r>
-    </w:p>
-    <w:p>
-      <w:pPr>
-        <w:pStyle w:val="BodyText"/>
-      </w:pPr>
-      <w:r>
-        <w:t xml:space="preserve">Valaitis AP (1995). Gypsy moth midgut proteinases: Purification and characterization of luminal trypsin, elastase and the brush border membrane leucine aminopeptidase. Insect Biochemistry and Molecular Biology 25, 139-149. doi: 10.1016/0965-1748(94)00033-e</w:t>
-      </w:r>
-    </w:p>
-    <w:p>
-      <w:pPr>
-        <w:pStyle w:val="BodyText"/>
-      </w:pPr>
-      <w:r>
-        <w:t xml:space="preserve">Valaitis AP, Augustin S, Clancy KM (1999). Purification and characterization of the western spruce budworm larval midgut proteinases and comparison of gut activities of laboratory-reared and field-collected insects. Insect Biochemistry and Molecular Biology 29, 405-415. doi: 10.1016/s0965-1748(99)00017-x</w:t>
-      </w:r>
-    </w:p>
-    <w:p>
-      <w:pPr>
-        <w:pStyle w:val="BodyText"/>
-      </w:pPr>
-      <w:r>
-        <w:t xml:space="preserve">Valdés-Tresanco MS, Valdés-Tresanco ME, Valiente PA, Moreno E (2021). gmx_MMPBSA: A New Tool to Perform End-State Free Energy Calculations with GROMACS. Journal of Chemical Theory and Computation 17, 6281-6291. doi: 10.1021/acs.jctc.1c00645</w:t>
-      </w:r>
-    </w:p>
-    <w:p>
-      <w:pPr>
-        <w:pStyle w:val="BodyText"/>
-      </w:pPr>
-      <w:r>
-        <w:t xml:space="preserve">van Kempen M, Kim SS, Tumescheit C, Mirdita M, Lee J, Gilchrist CLM, et al. (2024). Fast and accurate protein structure search with Foldseek. Nature Biotechnology 42, 243-246. doi: 10.1038/s41587-023-01773-0</w:t>
-      </w:r>
-    </w:p>
-    <w:p>
-      <w:pPr>
-        <w:pStyle w:val="BodyText"/>
-      </w:pPr>
-      <w:r>
-        <w:t xml:space="preserve">Varadi M, Bertoni D, Magana P, Paramval U, Pidruchna I, Radhakrishnan M, et al. (2024). AlphaFold Protein Structure Database in 2024: providing structure coverage for over 214 million protein sequences. Nucleic Acids Research 52, D368-D375. doi: 10.1093/nar/gkad1011</w:t>
-      </w:r>
-    </w:p>
-    <w:p>
-      <w:pPr>
-        <w:pStyle w:val="BodyText"/>
-      </w:pPr>
-      <w:r>
-        <w:t xml:space="preserve">Wacha AF, Lemkul JA (2023). charmm2gmx: An Automated Method to Port the CHARMM Additive Force Field to GROMACS. Journal of Chemical Information and Modeling 63, 4246-4252. doi: 10.1021/acs.jcim.3c00860</w:t>
-      </w:r>
-    </w:p>
-    <w:p>
-      <w:pPr>
-        <w:pStyle w:val="BodyText"/>
-      </w:pPr>
-      <w:r>
-        <w:t xml:space="preserve">Watson JL, Juergens D, Bennett NR, Trippe BL, Yim J, Eisenach HE, et al. (2023). De novo design of protein structure and function with RFdiffusion. Nature 620, 1089-1100. doi: 10.1038/s41586-023-06415-8</w:t>
-      </w:r>
-    </w:p>
-    <w:p>
-      <w:pPr>
-        <w:pStyle w:val="BodyText"/>
-      </w:pPr>
-      <w:r>
-        <w:t xml:space="preserve">Werner MH, Wemmer DE (1992). Three-dimensional structure of soybean trypsin/chymotrypsin Bowman-Birk inhibitor in solution. Biochemistry 31, 999-1010. doi: 10.1021/bi00119a008</w:t>
-      </w:r>
-    </w:p>
-    <w:p>
-      <w:pPr>
-        <w:pStyle w:val="BodyText"/>
-      </w:pPr>
-      <w:r>
-        <w:t xml:space="preserve">Wohlwend J, Corso G, Passaro S, Getz N, Reveiz M, Leidal K, et al. (2024). Boltz-1: Democratizing biomolecular interaction modeling. bioRxiv [Preprint]. doi: 10.1101/2024.11.19.624167</w:t>
-      </w:r>
-    </w:p>
-    <w:p>
-      <w:pPr>
-        <w:pStyle w:val="BodyText"/>
-      </w:pPr>
-      <w:r>
-        <w:t xml:space="preserve">Xu X, Zhou F, Zheng L, Wang S, Peng X, Li D (2025). Sampling Challenges of MM/PBSA Binding Energy Calculations. The Journal of Physical Chemistry B 129, 11666-11678. doi: 10.1021/acs.jpcb.5c04908</w:t>
-      </w:r>
-    </w:p>
-    <w:p>
-      <w:pPr>
-        <w:pStyle w:val="BodyText"/>
-      </w:pPr>
-      <w:r>
-        <w:t xml:space="preserve">Yang Y, Zhu YC, Ottea J, Husseneder C, Leonard BR, Abel C, et al. (2012). Characterization and transcriptional analyses of cDNAs encoding three trypsin- and chymotrypsin-like proteinases in Cry1Ab-susceptible and Cry1Ab-resistant strains of sugarcane borer, Diatraea saccharalis. Insect Science 20, 485-496. doi: 10.1111/j.1744-7917.2012.01514.x</w:t>
-      </w:r>
-    </w:p>
-    <w:p>
-      <w:pPr>
-        <w:pStyle w:val="BodyText"/>
-      </w:pPr>
-      <w:r>
-        <w:t xml:space="preserve">Zhan Q, Zheng S, Feng Q, Liu L (2010). A midgut-specific chymotrypsin cDNA (Slctlp1) from Spodoptera litura: cloning, characterization, localization and expression analysis. Archives of Insect Biochemistry and Physiology 76, 130-143. doi: 10.1002/arch.20353</w:t>
-      </w:r>
-    </w:p>
-    <w:p>
-      <w:pPr>
-        <w:pStyle w:val="BodyText"/>
-      </w:pPr>
-      <w:r>
-        <w:t xml:space="preserve">Zhang Y, Skolnick J (2005). TM-align: a protein structure alignment algorithm based on the TM-score. Nucleic Acids Research 33, 2302-2309. doi: 10.1093/nar/gki524</w:t>
-      </w:r>
-    </w:p>
-    <w:p>
-      <w:pPr>
-        <w:pStyle w:val="BodyText"/>
-      </w:pPr>
-      <w:r>
-        <w:t xml:space="preserve">Zhou D, Lobo YA, Batista IFC, Marques-Porto R, Gustchina A, Oliva MLV, et al. (2013). Crystal Structures of a Plant Trypsin Inhibitor from Enterolobium contortisiliquum (EcTI) and of Its Complex with Bovine Trypsin. PLoS ONE 8, e62252. doi: 10.1371/journal.pone.0062252</w:t>
-      </w:r>
-    </w:p>
     <w:bookmarkEnd w:id="95"/>
-    <w:bookmarkEnd w:id="96"/>
     <w:sectPr>
       <w:footerReference w:type="default" r:id="rId9"/>
       <w:footnotePr>

</xml_diff>